<commit_message>
Math T7 : scènes IA lot 4 (U3 s5-13 complètes + U4 s1) ; U3 rebuild 13 scènes
Co-authored-by: arena-agent <297053741+arena-agent@users.noreply.github.com>
</commit_message>
<xml_diff>
--- a/manuel-math-t7/Manuel_Mathematiques_T7_UNITE3.docx
+++ b/manuel-math-t7/Manuel_Mathematiques_T7_UNITE3.docx
@@ -2706,96 +2706,13 @@
     </w:p>
     <w:p>
       <w:pPr>
-        <w:spacing w:after="110" w:line="300"/>
-        <w:jc w:val="both"/>
-      </w:pPr>
-      <w:r>
-        <w:rPr>
-          <w:rFonts w:ascii="Times New Roman" w:cs="Times New Roman" w:eastAsia="Times New Roman" w:hAnsi="Times New Roman"/>
-          <w:b/>
-          <w:bCs/>
-          <w:i w:val="false"/>
-          <w:iCs w:val="false"/>
-          <w:color w:val="2E7D32"/>
-          <w:sz w:val="24"/>
-          <w:szCs w:val="24"/>
-        </w:rPr>
-        <w:t xml:space="preserve">Définition — </w:t>
-      </w:r>
-      <w:r>
-        <w:rPr>
-          <w:rFonts w:ascii="Times New Roman" w:cs="Times New Roman" w:eastAsia="Times New Roman" w:hAnsi="Times New Roman"/>
-          <w:b/>
-          <w:bCs/>
-          <w:i w:val="false"/>
-          <w:iCs w:val="false"/>
-          <w:color w:val="000000"/>
-          <w:sz w:val="24"/>
-          <w:szCs w:val="24"/>
-        </w:rPr>
-        <w:t xml:space="preserve">La distributivité simple de la multiplication sur l’addition s’écrit : k × (a + b) = k × a + k × b. Elle vaut aussi pour la soustraction : k × (a − b) = k × a − k × b.</w:t>
-      </w:r>
-    </w:p>
-    <w:p>
-      <w:pPr>
-        <w:spacing w:after="110" w:line="300"/>
-        <w:jc w:val="both"/>
-      </w:pPr>
-      <w:r>
-        <w:rPr>
-          <w:rFonts w:ascii="Times New Roman" w:cs="Times New Roman" w:eastAsia="Times New Roman" w:hAnsi="Times New Roman"/>
-          <w:b/>
-          <w:bCs/>
-          <w:i w:val="false"/>
-          <w:iCs w:val="false"/>
-          <w:color w:val="1F4E79"/>
-          <w:sz w:val="24"/>
-          <w:szCs w:val="24"/>
-        </w:rPr>
-        <w:t xml:space="preserve">Autrement dit : </w:t>
-      </w:r>
-      <w:r>
-        <w:rPr>
-          <w:rFonts w:ascii="Times New Roman" w:cs="Times New Roman" w:eastAsia="Times New Roman" w:hAnsi="Times New Roman"/>
-          <w:b w:val="false"/>
-          <w:bCs w:val="false"/>
-          <w:i w:val="false"/>
-          <w:iCs w:val="false"/>
-          <w:color w:val="000000"/>
-          <w:sz w:val="24"/>
-          <w:szCs w:val="24"/>
-        </w:rPr>
-        <w:t xml:space="preserve">multiplier une somme, c’est multiplier chaque morceau puis additionner les résultats.</w:t>
-      </w:r>
-    </w:p>
-    <w:p>
-      <w:pPr>
-        <w:spacing w:after="110" w:line="300"/>
-        <w:jc w:val="both"/>
-      </w:pPr>
-      <w:r>
-        <w:rPr>
-          <w:rFonts w:ascii="Times New Roman" w:cs="Times New Roman" w:eastAsia="Times New Roman" w:hAnsi="Times New Roman"/>
-          <w:b w:val="false"/>
-          <w:bCs w:val="false"/>
-          <w:i w:val="false"/>
-          <w:iCs w:val="false"/>
-          <w:color w:val="000000"/>
-          <w:sz w:val="24"/>
-          <w:szCs w:val="24"/>
-        </w:rPr>
-        <w:t xml:space="preserve">Sur le quadrillage, le grand rectangle 3 × (4 + 2) se découpe en deux rectangles 3 × 4 et 3 × 2 : l’aire totale est la même dans les deux calculs. La distributivité fonctionne dans les deux sens : développer, c’est passer de k(a + b) à ka + kb ; factoriser, c’est faire le chemin inverse.</w:t>
-      </w:r>
-    </w:p>
-    <w:p>
-      <w:pPr>
         <w:spacing w:after="120" w:before="120"/>
         <w:jc w:val="center"/>
       </w:pPr>
       <w:r>
         <w:drawing>
           <wp:inline distT="0" distB="0" distL="0" distR="0">
-            <wp:extent cx="4762500" cy="1876425"/>
+            <wp:extent cx="4095750" cy="2286000"/>
             <wp:effectExtent t="0" r="0" b="0" l="0"/>
             <wp:docPr id="1" name="" descr="" title=""/>
             <wp:cNvGraphicFramePr>
@@ -2812,6 +2729,135 @@
                   </pic:nvPicPr>
                   <pic:blipFill>
                     <a:blip r:embed="rId9" cstate="none"/>
+                    <a:srcRect/>
+                    <a:stretch>
+                      <a:fillRect/>
+                    </a:stretch>
+                  </pic:blipFill>
+                  <pic:spPr bwMode="auto">
+                    <a:xfrm>
+                      <a:off x="0" y="0"/>
+                      <a:ext cx="4095750" cy="2286000"/>
+                    </a:xfrm>
+                    <a:prstGeom prst="rect">
+                      <a:avLst/>
+                    </a:prstGeom>
+                  </pic:spPr>
+                </pic:pic>
+              </a:graphicData>
+            </a:graphic>
+          </wp:inline>
+        </w:drawing>
+      </w:r>
+    </w:p>
+    <w:p>
+      <w:pPr>
+        <w:spacing w:after="110" w:line="300"/>
+        <w:jc w:val="both"/>
+      </w:pPr>
+      <w:r>
+        <w:rPr>
+          <w:rFonts w:ascii="Times New Roman" w:cs="Times New Roman" w:eastAsia="Times New Roman" w:hAnsi="Times New Roman"/>
+          <w:b/>
+          <w:bCs/>
+          <w:i w:val="false"/>
+          <w:iCs w:val="false"/>
+          <w:color w:val="2E7D32"/>
+          <w:sz w:val="24"/>
+          <w:szCs w:val="24"/>
+        </w:rPr>
+        <w:t xml:space="preserve">Définition — </w:t>
+      </w:r>
+      <w:r>
+        <w:rPr>
+          <w:rFonts w:ascii="Times New Roman" w:cs="Times New Roman" w:eastAsia="Times New Roman" w:hAnsi="Times New Roman"/>
+          <w:b/>
+          <w:bCs/>
+          <w:i w:val="false"/>
+          <w:iCs w:val="false"/>
+          <w:color w:val="000000"/>
+          <w:sz w:val="24"/>
+          <w:szCs w:val="24"/>
+        </w:rPr>
+        <w:t xml:space="preserve">La distributivité simple de la multiplication sur l’addition s’écrit : k × (a + b) = k × a + k × b. Elle vaut aussi pour la soustraction : k × (a − b) = k × a − k × b.</w:t>
+      </w:r>
+    </w:p>
+    <w:p>
+      <w:pPr>
+        <w:spacing w:after="110" w:line="300"/>
+        <w:jc w:val="both"/>
+      </w:pPr>
+      <w:r>
+        <w:rPr>
+          <w:rFonts w:ascii="Times New Roman" w:cs="Times New Roman" w:eastAsia="Times New Roman" w:hAnsi="Times New Roman"/>
+          <w:b/>
+          <w:bCs/>
+          <w:i w:val="false"/>
+          <w:iCs w:val="false"/>
+          <w:color w:val="1F4E79"/>
+          <w:sz w:val="24"/>
+          <w:szCs w:val="24"/>
+        </w:rPr>
+        <w:t xml:space="preserve">Autrement dit : </w:t>
+      </w:r>
+      <w:r>
+        <w:rPr>
+          <w:rFonts w:ascii="Times New Roman" w:cs="Times New Roman" w:eastAsia="Times New Roman" w:hAnsi="Times New Roman"/>
+          <w:b w:val="false"/>
+          <w:bCs w:val="false"/>
+          <w:i w:val="false"/>
+          <w:iCs w:val="false"/>
+          <w:color w:val="000000"/>
+          <w:sz w:val="24"/>
+          <w:szCs w:val="24"/>
+        </w:rPr>
+        <w:t xml:space="preserve">multiplier une somme, c’est multiplier chaque morceau puis additionner les résultats.</w:t>
+      </w:r>
+    </w:p>
+    <w:p>
+      <w:pPr>
+        <w:spacing w:after="110" w:line="300"/>
+        <w:jc w:val="both"/>
+      </w:pPr>
+      <w:r>
+        <w:rPr>
+          <w:rFonts w:ascii="Times New Roman" w:cs="Times New Roman" w:eastAsia="Times New Roman" w:hAnsi="Times New Roman"/>
+          <w:b w:val="false"/>
+          <w:bCs w:val="false"/>
+          <w:i w:val="false"/>
+          <w:iCs w:val="false"/>
+          <w:color w:val="000000"/>
+          <w:sz w:val="24"/>
+          <w:szCs w:val="24"/>
+        </w:rPr>
+        <w:t xml:space="preserve">Sur le quadrillage, le grand rectangle 3 × (4 + 2) se découpe en deux rectangles 3 × 4 et 3 × 2 : l’aire totale est la même dans les deux calculs. La distributivité fonctionne dans les deux sens : développer, c’est passer de k(a + b) à ka + kb ; factoriser, c’est faire le chemin inverse.</w:t>
+      </w:r>
+    </w:p>
+    <w:p>
+      <w:pPr>
+        <w:spacing w:after="120" w:before="120"/>
+        <w:jc w:val="center"/>
+      </w:pPr>
+      <w:r>
+        <w:drawing>
+          <wp:inline distT="0" distB="0" distL="0" distR="0">
+            <wp:extent cx="4762500" cy="1876425"/>
+            <wp:effectExtent t="0" r="0" b="0" l="0"/>
+            <wp:docPr id="2" name="" descr="" title=""/>
+            <wp:cNvGraphicFramePr>
+              <a:graphicFrameLocks xmlns:a="http://schemas.openxmlformats.org/drawingml/2006/main" noChangeAspect="1"/>
+            </wp:cNvGraphicFramePr>
+            <a:graphic xmlns:a="http://schemas.openxmlformats.org/drawingml/2006/main">
+              <a:graphicData uri="http://schemas.openxmlformats.org/drawingml/2006/picture">
+                <pic:pic xmlns:pic="http://schemas.openxmlformats.org/drawingml/2006/picture">
+                  <pic:nvPicPr>
+                    <pic:cNvPr id="0" name="" descr=""/>
+                    <pic:cNvPicPr>
+                      <a:picLocks noChangeAspect="1" noChangeArrowheads="1"/>
+                    </pic:cNvPicPr>
+                  </pic:nvPicPr>
+                  <pic:blipFill>
+                    <a:blip r:embed="rId10" cstate="none"/>
                     <a:srcRect/>
                     <a:stretch>
                       <a:fillRect/>
@@ -5555,98 +5601,15 @@
     </w:p>
     <w:p>
       <w:pPr>
-        <w:spacing w:after="110" w:line="300"/>
-        <w:jc w:val="both"/>
-      </w:pPr>
-      <w:r>
-        <w:rPr>
-          <w:rFonts w:ascii="Times New Roman" w:cs="Times New Roman" w:eastAsia="Times New Roman" w:hAnsi="Times New Roman"/>
-          <w:b/>
-          <w:bCs/>
-          <w:i w:val="false"/>
-          <w:iCs w:val="false"/>
-          <w:color w:val="2E7D32"/>
-          <w:sz w:val="24"/>
-          <w:szCs w:val="24"/>
-        </w:rPr>
-        <w:t xml:space="preserve">Définition — </w:t>
-      </w:r>
-      <w:r>
-        <w:rPr>
-          <w:rFonts w:ascii="Times New Roman" w:cs="Times New Roman" w:eastAsia="Times New Roman" w:hAnsi="Times New Roman"/>
-          <w:b/>
-          <w:bCs/>
-          <w:i w:val="false"/>
-          <w:iCs w:val="false"/>
-          <w:color w:val="000000"/>
-          <w:sz w:val="24"/>
-          <w:szCs w:val="24"/>
-        </w:rPr>
-        <w:t xml:space="preserve">Pour multiplier rapidement, on décompose l’un des facteurs en une somme ou une différence simple, puis on distribue.</w:t>
-      </w:r>
-    </w:p>
-    <w:p>
-      <w:pPr>
-        <w:spacing w:after="110" w:line="300"/>
-        <w:jc w:val="both"/>
-      </w:pPr>
-      <w:r>
-        <w:rPr>
-          <w:rFonts w:ascii="Times New Roman" w:cs="Times New Roman" w:eastAsia="Times New Roman" w:hAnsi="Times New Roman"/>
-          <w:b/>
-          <w:bCs/>
-          <w:i w:val="false"/>
-          <w:iCs w:val="false"/>
-          <w:color w:val="1F4E79"/>
-          <w:sz w:val="24"/>
-          <w:szCs w:val="24"/>
-        </w:rPr>
-        <w:t xml:space="preserve">Autrement dit : </w:t>
-      </w:r>
-      <w:r>
-        <w:rPr>
-          <w:rFonts w:ascii="Times New Roman" w:cs="Times New Roman" w:eastAsia="Times New Roman" w:hAnsi="Times New Roman"/>
-          <w:b w:val="false"/>
-          <w:bCs w:val="false"/>
-          <w:i w:val="false"/>
-          <w:iCs w:val="false"/>
-          <w:color w:val="000000"/>
-          <w:sz w:val="24"/>
-          <w:szCs w:val="24"/>
-        </w:rPr>
-        <w:t xml:space="preserve">on coupe le nombre compliqué en morceaux faciles : 103 = 100 + 3, ou 98 = 100 − 2.</w:t>
-      </w:r>
-    </w:p>
-    <w:p>
-      <w:pPr>
-        <w:spacing w:after="110" w:line="300"/>
-        <w:jc w:val="both"/>
-      </w:pPr>
-      <w:r>
-        <w:rPr>
-          <w:rFonts w:ascii="Times New Roman" w:cs="Times New Roman" w:eastAsia="Times New Roman" w:hAnsi="Times New Roman"/>
-          <w:b w:val="false"/>
-          <w:bCs w:val="false"/>
-          <w:i w:val="false"/>
-          <w:iCs w:val="false"/>
-          <w:color w:val="000000"/>
-          <w:sz w:val="24"/>
-          <w:szCs w:val="24"/>
-        </w:rPr>
-        <w:t xml:space="preserve">Près d’une centaine ou d’une dizaine ronde, la distributivité fait gagner du temps : 7 × 103 = 7 × (100 + 3) = 700 + 21 = 721 et 6 × 98 = 6 × (100 − 2) = 600 − 12 = 588. La même astuce marche avec les décimaux : 4 × 2,5 = 4 × (2 + 0,5) = 8 + 2 = 10.</w:t>
-      </w:r>
-    </w:p>
-    <w:p>
-      <w:pPr>
         <w:spacing w:after="120" w:before="120"/>
         <w:jc w:val="center"/>
       </w:pPr>
       <w:r>
         <w:drawing>
           <wp:inline distT="0" distB="0" distL="0" distR="0">
-            <wp:extent cx="4762500" cy="1352550"/>
+            <wp:extent cx="4095750" cy="2286000"/>
             <wp:effectExtent t="0" r="0" b="0" l="0"/>
-            <wp:docPr id="2" name="" descr="" title=""/>
+            <wp:docPr id="3" name="" descr="" title=""/>
             <wp:cNvGraphicFramePr>
               <a:graphicFrameLocks xmlns:a="http://schemas.openxmlformats.org/drawingml/2006/main" noChangeAspect="1"/>
             </wp:cNvGraphicFramePr>
@@ -5660,7 +5623,136 @@
                     </pic:cNvPicPr>
                   </pic:nvPicPr>
                   <pic:blipFill>
-                    <a:blip r:embed="rId10" cstate="none"/>
+                    <a:blip r:embed="rId11" cstate="none"/>
+                    <a:srcRect/>
+                    <a:stretch>
+                      <a:fillRect/>
+                    </a:stretch>
+                  </pic:blipFill>
+                  <pic:spPr bwMode="auto">
+                    <a:xfrm>
+                      <a:off x="0" y="0"/>
+                      <a:ext cx="4095750" cy="2286000"/>
+                    </a:xfrm>
+                    <a:prstGeom prst="rect">
+                      <a:avLst/>
+                    </a:prstGeom>
+                  </pic:spPr>
+                </pic:pic>
+              </a:graphicData>
+            </a:graphic>
+          </wp:inline>
+        </w:drawing>
+      </w:r>
+    </w:p>
+    <w:p>
+      <w:pPr>
+        <w:spacing w:after="110" w:line="300"/>
+        <w:jc w:val="both"/>
+      </w:pPr>
+      <w:r>
+        <w:rPr>
+          <w:rFonts w:ascii="Times New Roman" w:cs="Times New Roman" w:eastAsia="Times New Roman" w:hAnsi="Times New Roman"/>
+          <w:b/>
+          <w:bCs/>
+          <w:i w:val="false"/>
+          <w:iCs w:val="false"/>
+          <w:color w:val="2E7D32"/>
+          <w:sz w:val="24"/>
+          <w:szCs w:val="24"/>
+        </w:rPr>
+        <w:t xml:space="preserve">Définition — </w:t>
+      </w:r>
+      <w:r>
+        <w:rPr>
+          <w:rFonts w:ascii="Times New Roman" w:cs="Times New Roman" w:eastAsia="Times New Roman" w:hAnsi="Times New Roman"/>
+          <w:b/>
+          <w:bCs/>
+          <w:i w:val="false"/>
+          <w:iCs w:val="false"/>
+          <w:color w:val="000000"/>
+          <w:sz w:val="24"/>
+          <w:szCs w:val="24"/>
+        </w:rPr>
+        <w:t xml:space="preserve">Pour multiplier rapidement, on décompose l’un des facteurs en une somme ou une différence simple, puis on distribue.</w:t>
+      </w:r>
+    </w:p>
+    <w:p>
+      <w:pPr>
+        <w:spacing w:after="110" w:line="300"/>
+        <w:jc w:val="both"/>
+      </w:pPr>
+      <w:r>
+        <w:rPr>
+          <w:rFonts w:ascii="Times New Roman" w:cs="Times New Roman" w:eastAsia="Times New Roman" w:hAnsi="Times New Roman"/>
+          <w:b/>
+          <w:bCs/>
+          <w:i w:val="false"/>
+          <w:iCs w:val="false"/>
+          <w:color w:val="1F4E79"/>
+          <w:sz w:val="24"/>
+          <w:szCs w:val="24"/>
+        </w:rPr>
+        <w:t xml:space="preserve">Autrement dit : </w:t>
+      </w:r>
+      <w:r>
+        <w:rPr>
+          <w:rFonts w:ascii="Times New Roman" w:cs="Times New Roman" w:eastAsia="Times New Roman" w:hAnsi="Times New Roman"/>
+          <w:b w:val="false"/>
+          <w:bCs w:val="false"/>
+          <w:i w:val="false"/>
+          <w:iCs w:val="false"/>
+          <w:color w:val="000000"/>
+          <w:sz w:val="24"/>
+          <w:szCs w:val="24"/>
+        </w:rPr>
+        <w:t xml:space="preserve">on coupe le nombre compliqué en morceaux faciles : 103 = 100 + 3, ou 98 = 100 − 2.</w:t>
+      </w:r>
+    </w:p>
+    <w:p>
+      <w:pPr>
+        <w:spacing w:after="110" w:line="300"/>
+        <w:jc w:val="both"/>
+      </w:pPr>
+      <w:r>
+        <w:rPr>
+          <w:rFonts w:ascii="Times New Roman" w:cs="Times New Roman" w:eastAsia="Times New Roman" w:hAnsi="Times New Roman"/>
+          <w:b w:val="false"/>
+          <w:bCs w:val="false"/>
+          <w:i w:val="false"/>
+          <w:iCs w:val="false"/>
+          <w:color w:val="000000"/>
+          <w:sz w:val="24"/>
+          <w:szCs w:val="24"/>
+        </w:rPr>
+        <w:t xml:space="preserve">Près d’une centaine ou d’une dizaine ronde, la distributivité fait gagner du temps : 7 × 103 = 7 × (100 + 3) = 700 + 21 = 721 et 6 × 98 = 6 × (100 − 2) = 600 − 12 = 588. La même astuce marche avec les décimaux : 4 × 2,5 = 4 × (2 + 0,5) = 8 + 2 = 10.</w:t>
+      </w:r>
+    </w:p>
+    <w:p>
+      <w:pPr>
+        <w:spacing w:after="120" w:before="120"/>
+        <w:jc w:val="center"/>
+      </w:pPr>
+      <w:r>
+        <w:drawing>
+          <wp:inline distT="0" distB="0" distL="0" distR="0">
+            <wp:extent cx="4762500" cy="1352550"/>
+            <wp:effectExtent t="0" r="0" b="0" l="0"/>
+            <wp:docPr id="4" name="" descr="" title=""/>
+            <wp:cNvGraphicFramePr>
+              <a:graphicFrameLocks xmlns:a="http://schemas.openxmlformats.org/drawingml/2006/main" noChangeAspect="1"/>
+            </wp:cNvGraphicFramePr>
+            <a:graphic xmlns:a="http://schemas.openxmlformats.org/drawingml/2006/main">
+              <a:graphicData uri="http://schemas.openxmlformats.org/drawingml/2006/picture">
+                <pic:pic xmlns:pic="http://schemas.openxmlformats.org/drawingml/2006/picture">
+                  <pic:nvPicPr>
+                    <pic:cNvPr id="0" name="" descr=""/>
+                    <pic:cNvPicPr>
+                      <a:picLocks noChangeAspect="1" noChangeArrowheads="1"/>
+                    </pic:cNvPicPr>
+                  </pic:nvPicPr>
+                  <pic:blipFill>
+                    <a:blip r:embed="rId12" cstate="none"/>
                     <a:srcRect/>
                     <a:stretch>
                       <a:fillRect/>
@@ -8404,98 +8496,15 @@
     </w:p>
     <w:p>
       <w:pPr>
-        <w:spacing w:after="110" w:line="300"/>
-        <w:jc w:val="both"/>
-      </w:pPr>
-      <w:r>
-        <w:rPr>
-          <w:rFonts w:ascii="Times New Roman" w:cs="Times New Roman" w:eastAsia="Times New Roman" w:hAnsi="Times New Roman"/>
-          <w:b/>
-          <w:bCs/>
-          <w:i w:val="false"/>
-          <w:iCs w:val="false"/>
-          <w:color w:val="2E7D32"/>
-          <w:sz w:val="24"/>
-          <w:szCs w:val="24"/>
-        </w:rPr>
-        <w:t xml:space="preserve">Définition — </w:t>
-      </w:r>
-      <w:r>
-        <w:rPr>
-          <w:rFonts w:ascii="Times New Roman" w:cs="Times New Roman" w:eastAsia="Times New Roman" w:hAnsi="Times New Roman"/>
-          <w:b/>
-          <w:bCs/>
-          <w:i w:val="false"/>
-          <w:iCs w:val="false"/>
-          <w:color w:val="000000"/>
-          <w:sz w:val="24"/>
-          <w:szCs w:val="24"/>
-        </w:rPr>
-        <w:t xml:space="preserve">Factoriser une somme, c’est l’écrire sous la forme d’un produit en mettant en évidence un facteur commun : k × a + k × b = k × (a + b).</w:t>
-      </w:r>
-    </w:p>
-    <w:p>
-      <w:pPr>
-        <w:spacing w:after="110" w:line="300"/>
-        <w:jc w:val="both"/>
-      </w:pPr>
-      <w:r>
-        <w:rPr>
-          <w:rFonts w:ascii="Times New Roman" w:cs="Times New Roman" w:eastAsia="Times New Roman" w:hAnsi="Times New Roman"/>
-          <w:b/>
-          <w:bCs/>
-          <w:i w:val="false"/>
-          <w:iCs w:val="false"/>
-          <w:color w:val="1F4E79"/>
-          <w:sz w:val="24"/>
-          <w:szCs w:val="24"/>
-        </w:rPr>
-        <w:t xml:space="preserve">Autrement dit : </w:t>
-      </w:r>
-      <w:r>
-        <w:rPr>
-          <w:rFonts w:ascii="Times New Roman" w:cs="Times New Roman" w:eastAsia="Times New Roman" w:hAnsi="Times New Roman"/>
-          <w:b w:val="false"/>
-          <w:bCs w:val="false"/>
-          <w:i w:val="false"/>
-          <w:iCs w:val="false"/>
-          <w:color w:val="000000"/>
-          <w:sz w:val="24"/>
-          <w:szCs w:val="24"/>
-        </w:rPr>
-        <w:t xml:space="preserve">c’est la distributivité à l’envers : au lieu de distribuer le facteur, on le « sort » de chaque terme.</w:t>
-      </w:r>
-    </w:p>
-    <w:p>
-      <w:pPr>
-        <w:spacing w:after="110" w:line="300"/>
-        <w:jc w:val="both"/>
-      </w:pPr>
-      <w:r>
-        <w:rPr>
-          <w:rFonts w:ascii="Times New Roman" w:cs="Times New Roman" w:eastAsia="Times New Roman" w:hAnsi="Times New Roman"/>
-          <w:b w:val="false"/>
-          <w:bCs w:val="false"/>
-          <w:i w:val="false"/>
-          <w:iCs w:val="false"/>
-          <w:color w:val="000000"/>
-          <w:sz w:val="24"/>
-          <w:szCs w:val="24"/>
-        </w:rPr>
-        <w:t xml:space="preserve">Dans 3x + 3y, le facteur commun est 3 : 3x + 3y = 3(x + y). Dans 5a + 10, on remarque 10 = 5 × 2 : 5a + 10 = 5(a + 2). La factorisation marche aussi avec la soustraction : 7x − 7 = 7(x − 1). Pour vérifier, on développe le résultat : on doit retrouver l’expression de départ.</w:t>
-      </w:r>
-    </w:p>
-    <w:p>
-      <w:pPr>
         <w:spacing w:after="120" w:before="120"/>
         <w:jc w:val="center"/>
       </w:pPr>
       <w:r>
         <w:drawing>
           <wp:inline distT="0" distB="0" distL="0" distR="0">
-            <wp:extent cx="4762500" cy="1352550"/>
+            <wp:extent cx="4095750" cy="2286000"/>
             <wp:effectExtent t="0" r="0" b="0" l="0"/>
-            <wp:docPr id="3" name="" descr="" title=""/>
+            <wp:docPr id="5" name="" descr="" title=""/>
             <wp:cNvGraphicFramePr>
               <a:graphicFrameLocks xmlns:a="http://schemas.openxmlformats.org/drawingml/2006/main" noChangeAspect="1"/>
             </wp:cNvGraphicFramePr>
@@ -8509,7 +8518,136 @@
                     </pic:cNvPicPr>
                   </pic:nvPicPr>
                   <pic:blipFill>
-                    <a:blip r:embed="rId11" cstate="none"/>
+                    <a:blip r:embed="rId13" cstate="none"/>
+                    <a:srcRect/>
+                    <a:stretch>
+                      <a:fillRect/>
+                    </a:stretch>
+                  </pic:blipFill>
+                  <pic:spPr bwMode="auto">
+                    <a:xfrm>
+                      <a:off x="0" y="0"/>
+                      <a:ext cx="4095750" cy="2286000"/>
+                    </a:xfrm>
+                    <a:prstGeom prst="rect">
+                      <a:avLst/>
+                    </a:prstGeom>
+                  </pic:spPr>
+                </pic:pic>
+              </a:graphicData>
+            </a:graphic>
+          </wp:inline>
+        </w:drawing>
+      </w:r>
+    </w:p>
+    <w:p>
+      <w:pPr>
+        <w:spacing w:after="110" w:line="300"/>
+        <w:jc w:val="both"/>
+      </w:pPr>
+      <w:r>
+        <w:rPr>
+          <w:rFonts w:ascii="Times New Roman" w:cs="Times New Roman" w:eastAsia="Times New Roman" w:hAnsi="Times New Roman"/>
+          <w:b/>
+          <w:bCs/>
+          <w:i w:val="false"/>
+          <w:iCs w:val="false"/>
+          <w:color w:val="2E7D32"/>
+          <w:sz w:val="24"/>
+          <w:szCs w:val="24"/>
+        </w:rPr>
+        <w:t xml:space="preserve">Définition — </w:t>
+      </w:r>
+      <w:r>
+        <w:rPr>
+          <w:rFonts w:ascii="Times New Roman" w:cs="Times New Roman" w:eastAsia="Times New Roman" w:hAnsi="Times New Roman"/>
+          <w:b/>
+          <w:bCs/>
+          <w:i w:val="false"/>
+          <w:iCs w:val="false"/>
+          <w:color w:val="000000"/>
+          <w:sz w:val="24"/>
+          <w:szCs w:val="24"/>
+        </w:rPr>
+        <w:t xml:space="preserve">Factoriser une somme, c’est l’écrire sous la forme d’un produit en mettant en évidence un facteur commun : k × a + k × b = k × (a + b).</w:t>
+      </w:r>
+    </w:p>
+    <w:p>
+      <w:pPr>
+        <w:spacing w:after="110" w:line="300"/>
+        <w:jc w:val="both"/>
+      </w:pPr>
+      <w:r>
+        <w:rPr>
+          <w:rFonts w:ascii="Times New Roman" w:cs="Times New Roman" w:eastAsia="Times New Roman" w:hAnsi="Times New Roman"/>
+          <w:b/>
+          <w:bCs/>
+          <w:i w:val="false"/>
+          <w:iCs w:val="false"/>
+          <w:color w:val="1F4E79"/>
+          <w:sz w:val="24"/>
+          <w:szCs w:val="24"/>
+        </w:rPr>
+        <w:t xml:space="preserve">Autrement dit : </w:t>
+      </w:r>
+      <w:r>
+        <w:rPr>
+          <w:rFonts w:ascii="Times New Roman" w:cs="Times New Roman" w:eastAsia="Times New Roman" w:hAnsi="Times New Roman"/>
+          <w:b w:val="false"/>
+          <w:bCs w:val="false"/>
+          <w:i w:val="false"/>
+          <w:iCs w:val="false"/>
+          <w:color w:val="000000"/>
+          <w:sz w:val="24"/>
+          <w:szCs w:val="24"/>
+        </w:rPr>
+        <w:t xml:space="preserve">c’est la distributivité à l’envers : au lieu de distribuer le facteur, on le « sort » de chaque terme.</w:t>
+      </w:r>
+    </w:p>
+    <w:p>
+      <w:pPr>
+        <w:spacing w:after="110" w:line="300"/>
+        <w:jc w:val="both"/>
+      </w:pPr>
+      <w:r>
+        <w:rPr>
+          <w:rFonts w:ascii="Times New Roman" w:cs="Times New Roman" w:eastAsia="Times New Roman" w:hAnsi="Times New Roman"/>
+          <w:b w:val="false"/>
+          <w:bCs w:val="false"/>
+          <w:i w:val="false"/>
+          <w:iCs w:val="false"/>
+          <w:color w:val="000000"/>
+          <w:sz w:val="24"/>
+          <w:szCs w:val="24"/>
+        </w:rPr>
+        <w:t xml:space="preserve">Dans 3x + 3y, le facteur commun est 3 : 3x + 3y = 3(x + y). Dans 5a + 10, on remarque 10 = 5 × 2 : 5a + 10 = 5(a + 2). La factorisation marche aussi avec la soustraction : 7x − 7 = 7(x − 1). Pour vérifier, on développe le résultat : on doit retrouver l’expression de départ.</w:t>
+      </w:r>
+    </w:p>
+    <w:p>
+      <w:pPr>
+        <w:spacing w:after="120" w:before="120"/>
+        <w:jc w:val="center"/>
+      </w:pPr>
+      <w:r>
+        <w:drawing>
+          <wp:inline distT="0" distB="0" distL="0" distR="0">
+            <wp:extent cx="4762500" cy="1352550"/>
+            <wp:effectExtent t="0" r="0" b="0" l="0"/>
+            <wp:docPr id="6" name="" descr="" title=""/>
+            <wp:cNvGraphicFramePr>
+              <a:graphicFrameLocks xmlns:a="http://schemas.openxmlformats.org/drawingml/2006/main" noChangeAspect="1"/>
+            </wp:cNvGraphicFramePr>
+            <a:graphic xmlns:a="http://schemas.openxmlformats.org/drawingml/2006/main">
+              <a:graphicData uri="http://schemas.openxmlformats.org/drawingml/2006/picture">
+                <pic:pic xmlns:pic="http://schemas.openxmlformats.org/drawingml/2006/picture">
+                  <pic:nvPicPr>
+                    <pic:cNvPr id="0" name="" descr=""/>
+                    <pic:cNvPicPr>
+                      <a:picLocks noChangeAspect="1" noChangeArrowheads="1"/>
+                    </pic:cNvPicPr>
+                  </pic:nvPicPr>
+                  <pic:blipFill>
+                    <a:blip r:embed="rId14" cstate="none"/>
                     <a:srcRect/>
                     <a:stretch>
                       <a:fillRect/>
@@ -11253,98 +11391,15 @@
     </w:p>
     <w:p>
       <w:pPr>
-        <w:spacing w:after="110" w:line="300"/>
-        <w:jc w:val="both"/>
-      </w:pPr>
-      <w:r>
-        <w:rPr>
-          <w:rFonts w:ascii="Times New Roman" w:cs="Times New Roman" w:eastAsia="Times New Roman" w:hAnsi="Times New Roman"/>
-          <w:b/>
-          <w:bCs/>
-          <w:i w:val="false"/>
-          <w:iCs w:val="false"/>
-          <w:color w:val="2E7D32"/>
-          <w:sz w:val="24"/>
-          <w:szCs w:val="24"/>
-        </w:rPr>
-        <w:t xml:space="preserve">Définition — </w:t>
-      </w:r>
-      <w:r>
-        <w:rPr>
-          <w:rFonts w:ascii="Times New Roman" w:cs="Times New Roman" w:eastAsia="Times New Roman" w:hAnsi="Times New Roman"/>
-          <w:b/>
-          <w:bCs/>
-          <w:i w:val="false"/>
-          <w:iCs w:val="false"/>
-          <w:color w:val="000000"/>
-          <w:sz w:val="24"/>
-          <w:szCs w:val="24"/>
-        </w:rPr>
-        <w:t xml:space="preserve">Dans un problème, la distributivité permet de choisir le calcul le plus simple : compter article par article (k × a + k × b) ou compter par lot (k × (a + b)).</w:t>
-      </w:r>
-    </w:p>
-    <w:p>
-      <w:pPr>
-        <w:spacing w:after="110" w:line="300"/>
-        <w:jc w:val="both"/>
-      </w:pPr>
-      <w:r>
-        <w:rPr>
-          <w:rFonts w:ascii="Times New Roman" w:cs="Times New Roman" w:eastAsia="Times New Roman" w:hAnsi="Times New Roman"/>
-          <w:b/>
-          <w:bCs/>
-          <w:i w:val="false"/>
-          <w:iCs w:val="false"/>
-          <w:color w:val="1F4E79"/>
-          <w:sz w:val="24"/>
-          <w:szCs w:val="24"/>
-        </w:rPr>
-        <w:t xml:space="preserve">Autrement dit : </w:t>
-      </w:r>
-      <w:r>
-        <w:rPr>
-          <w:rFonts w:ascii="Times New Roman" w:cs="Times New Roman" w:eastAsia="Times New Roman" w:hAnsi="Times New Roman"/>
-          <w:b w:val="false"/>
-          <w:bCs w:val="false"/>
-          <w:i w:val="false"/>
-          <w:iCs w:val="false"/>
-          <w:color w:val="000000"/>
-          <w:sz w:val="24"/>
-          <w:szCs w:val="24"/>
-        </w:rPr>
-        <w:t xml:space="preserve">soit on calcule le prix de tous les cahiers puis de tous les stylos, soit le prix d’un lot complet multiplié par le nombre d’enfants.</w:t>
-      </w:r>
-    </w:p>
-    <w:p>
-      <w:pPr>
-        <w:spacing w:after="110" w:line="300"/>
-        <w:jc w:val="both"/>
-      </w:pPr>
-      <w:r>
-        <w:rPr>
-          <w:rFonts w:ascii="Times New Roman" w:cs="Times New Roman" w:eastAsia="Times New Roman" w:hAnsi="Times New Roman"/>
-          <w:b w:val="false"/>
-          <w:bCs w:val="false"/>
-          <w:i w:val="false"/>
-          <w:iCs w:val="false"/>
-          <w:color w:val="000000"/>
-          <w:sz w:val="24"/>
-          <w:szCs w:val="24"/>
-        </w:rPr>
-        <w:t xml:space="preserve">Première méthode : 5 × 1 200 + 5 × 800 = 6 000 + 4 000 = 10 000 Ar. Deuxième méthode : chaque enfant reçoit un lot à 1 200 + 800 = 2 000 Ar, donc 5 × 2 000 = 10 000 Ar. La factorisation regroupe les achats en lots ; la distributivité les détaille. On choisit le sens qui rend le calcul mental facile.</w:t>
-      </w:r>
-    </w:p>
-    <w:p>
-      <w:pPr>
         <w:spacing w:after="120" w:before="120"/>
         <w:jc w:val="center"/>
       </w:pPr>
       <w:r>
         <w:drawing>
           <wp:inline distT="0" distB="0" distL="0" distR="0">
-            <wp:extent cx="4762500" cy="1743075"/>
+            <wp:extent cx="4095750" cy="2286000"/>
             <wp:effectExtent t="0" r="0" b="0" l="0"/>
-            <wp:docPr id="4" name="" descr="" title=""/>
+            <wp:docPr id="7" name="" descr="" title=""/>
             <wp:cNvGraphicFramePr>
               <a:graphicFrameLocks xmlns:a="http://schemas.openxmlformats.org/drawingml/2006/main" noChangeAspect="1"/>
             </wp:cNvGraphicFramePr>
@@ -11358,7 +11413,136 @@
                     </pic:cNvPicPr>
                   </pic:nvPicPr>
                   <pic:blipFill>
-                    <a:blip r:embed="rId12" cstate="none"/>
+                    <a:blip r:embed="rId15" cstate="none"/>
+                    <a:srcRect/>
+                    <a:stretch>
+                      <a:fillRect/>
+                    </a:stretch>
+                  </pic:blipFill>
+                  <pic:spPr bwMode="auto">
+                    <a:xfrm>
+                      <a:off x="0" y="0"/>
+                      <a:ext cx="4095750" cy="2286000"/>
+                    </a:xfrm>
+                    <a:prstGeom prst="rect">
+                      <a:avLst/>
+                    </a:prstGeom>
+                  </pic:spPr>
+                </pic:pic>
+              </a:graphicData>
+            </a:graphic>
+          </wp:inline>
+        </w:drawing>
+      </w:r>
+    </w:p>
+    <w:p>
+      <w:pPr>
+        <w:spacing w:after="110" w:line="300"/>
+        <w:jc w:val="both"/>
+      </w:pPr>
+      <w:r>
+        <w:rPr>
+          <w:rFonts w:ascii="Times New Roman" w:cs="Times New Roman" w:eastAsia="Times New Roman" w:hAnsi="Times New Roman"/>
+          <w:b/>
+          <w:bCs/>
+          <w:i w:val="false"/>
+          <w:iCs w:val="false"/>
+          <w:color w:val="2E7D32"/>
+          <w:sz w:val="24"/>
+          <w:szCs w:val="24"/>
+        </w:rPr>
+        <w:t xml:space="preserve">Définition — </w:t>
+      </w:r>
+      <w:r>
+        <w:rPr>
+          <w:rFonts w:ascii="Times New Roman" w:cs="Times New Roman" w:eastAsia="Times New Roman" w:hAnsi="Times New Roman"/>
+          <w:b/>
+          <w:bCs/>
+          <w:i w:val="false"/>
+          <w:iCs w:val="false"/>
+          <w:color w:val="000000"/>
+          <w:sz w:val="24"/>
+          <w:szCs w:val="24"/>
+        </w:rPr>
+        <w:t xml:space="preserve">Dans un problème, la distributivité permet de choisir le calcul le plus simple : compter article par article (k × a + k × b) ou compter par lot (k × (a + b)).</w:t>
+      </w:r>
+    </w:p>
+    <w:p>
+      <w:pPr>
+        <w:spacing w:after="110" w:line="300"/>
+        <w:jc w:val="both"/>
+      </w:pPr>
+      <w:r>
+        <w:rPr>
+          <w:rFonts w:ascii="Times New Roman" w:cs="Times New Roman" w:eastAsia="Times New Roman" w:hAnsi="Times New Roman"/>
+          <w:b/>
+          <w:bCs/>
+          <w:i w:val="false"/>
+          <w:iCs w:val="false"/>
+          <w:color w:val="1F4E79"/>
+          <w:sz w:val="24"/>
+          <w:szCs w:val="24"/>
+        </w:rPr>
+        <w:t xml:space="preserve">Autrement dit : </w:t>
+      </w:r>
+      <w:r>
+        <w:rPr>
+          <w:rFonts w:ascii="Times New Roman" w:cs="Times New Roman" w:eastAsia="Times New Roman" w:hAnsi="Times New Roman"/>
+          <w:b w:val="false"/>
+          <w:bCs w:val="false"/>
+          <w:i w:val="false"/>
+          <w:iCs w:val="false"/>
+          <w:color w:val="000000"/>
+          <w:sz w:val="24"/>
+          <w:szCs w:val="24"/>
+        </w:rPr>
+        <w:t xml:space="preserve">soit on calcule le prix de tous les cahiers puis de tous les stylos, soit le prix d’un lot complet multiplié par le nombre d’enfants.</w:t>
+      </w:r>
+    </w:p>
+    <w:p>
+      <w:pPr>
+        <w:spacing w:after="110" w:line="300"/>
+        <w:jc w:val="both"/>
+      </w:pPr>
+      <w:r>
+        <w:rPr>
+          <w:rFonts w:ascii="Times New Roman" w:cs="Times New Roman" w:eastAsia="Times New Roman" w:hAnsi="Times New Roman"/>
+          <w:b w:val="false"/>
+          <w:bCs w:val="false"/>
+          <w:i w:val="false"/>
+          <w:iCs w:val="false"/>
+          <w:color w:val="000000"/>
+          <w:sz w:val="24"/>
+          <w:szCs w:val="24"/>
+        </w:rPr>
+        <w:t xml:space="preserve">Première méthode : 5 × 1 200 + 5 × 800 = 6 000 + 4 000 = 10 000 Ar. Deuxième méthode : chaque enfant reçoit un lot à 1 200 + 800 = 2 000 Ar, donc 5 × 2 000 = 10 000 Ar. La factorisation regroupe les achats en lots ; la distributivité les détaille. On choisit le sens qui rend le calcul mental facile.</w:t>
+      </w:r>
+    </w:p>
+    <w:p>
+      <w:pPr>
+        <w:spacing w:after="120" w:before="120"/>
+        <w:jc w:val="center"/>
+      </w:pPr>
+      <w:r>
+        <w:drawing>
+          <wp:inline distT="0" distB="0" distL="0" distR="0">
+            <wp:extent cx="4762500" cy="1743075"/>
+            <wp:effectExtent t="0" r="0" b="0" l="0"/>
+            <wp:docPr id="8" name="" descr="" title=""/>
+            <wp:cNvGraphicFramePr>
+              <a:graphicFrameLocks xmlns:a="http://schemas.openxmlformats.org/drawingml/2006/main" noChangeAspect="1"/>
+            </wp:cNvGraphicFramePr>
+            <a:graphic xmlns:a="http://schemas.openxmlformats.org/drawingml/2006/main">
+              <a:graphicData uri="http://schemas.openxmlformats.org/drawingml/2006/picture">
+                <pic:pic xmlns:pic="http://schemas.openxmlformats.org/drawingml/2006/picture">
+                  <pic:nvPicPr>
+                    <pic:cNvPr id="0" name="" descr=""/>
+                    <pic:cNvPicPr>
+                      <a:picLocks noChangeAspect="1" noChangeArrowheads="1"/>
+                    </pic:cNvPicPr>
+                  </pic:nvPicPr>
+                  <pic:blipFill>
+                    <a:blip r:embed="rId16" cstate="none"/>
                     <a:srcRect/>
                     <a:stretch>
                       <a:fillRect/>
@@ -14102,98 +14286,15 @@
     </w:p>
     <w:p>
       <w:pPr>
-        <w:spacing w:after="110" w:line="300"/>
-        <w:jc w:val="both"/>
-      </w:pPr>
-      <w:r>
-        <w:rPr>
-          <w:rFonts w:ascii="Times New Roman" w:cs="Times New Roman" w:eastAsia="Times New Roman" w:hAnsi="Times New Roman"/>
-          <w:b/>
-          <w:bCs/>
-          <w:i w:val="false"/>
-          <w:iCs w:val="false"/>
-          <w:color w:val="2E7D32"/>
-          <w:sz w:val="24"/>
-          <w:szCs w:val="24"/>
-        </w:rPr>
-        <w:t xml:space="preserve">Définition — </w:t>
-      </w:r>
-      <w:r>
-        <w:rPr>
-          <w:rFonts w:ascii="Times New Roman" w:cs="Times New Roman" w:eastAsia="Times New Roman" w:hAnsi="Times New Roman"/>
-          <w:b/>
-          <w:bCs/>
-          <w:i w:val="false"/>
-          <w:iCs w:val="false"/>
-          <w:color w:val="000000"/>
-          <w:sz w:val="24"/>
-          <w:szCs w:val="24"/>
-        </w:rPr>
-        <w:t xml:space="preserve">Une variable est une lettre, comme x, qui représente un nombre pouvant prendre différentes valeurs.</w:t>
-      </w:r>
-    </w:p>
-    <w:p>
-      <w:pPr>
-        <w:spacing w:after="110" w:line="300"/>
-        <w:jc w:val="both"/>
-      </w:pPr>
-      <w:r>
-        <w:rPr>
-          <w:rFonts w:ascii="Times New Roman" w:cs="Times New Roman" w:eastAsia="Times New Roman" w:hAnsi="Times New Roman"/>
-          <w:b/>
-          <w:bCs/>
-          <w:i w:val="false"/>
-          <w:iCs w:val="false"/>
-          <w:color w:val="1F4E79"/>
-          <w:sz w:val="24"/>
-          <w:szCs w:val="24"/>
-        </w:rPr>
-        <w:t xml:space="preserve">Autrement dit : </w:t>
-      </w:r>
-      <w:r>
-        <w:rPr>
-          <w:rFonts w:ascii="Times New Roman" w:cs="Times New Roman" w:eastAsia="Times New Roman" w:hAnsi="Times New Roman"/>
-          <w:b w:val="false"/>
-          <w:bCs w:val="false"/>
-          <w:i w:val="false"/>
-          <w:iCs w:val="false"/>
-          <w:color w:val="000000"/>
-          <w:sz w:val="24"/>
-          <w:szCs w:val="24"/>
-        </w:rPr>
-        <w:t xml:space="preserve">la lettre x est une « case vide » : on peut y glisser 3, 10 ou n’importe quel nombre.</w:t>
-      </w:r>
-    </w:p>
-    <w:p>
-      <w:pPr>
-        <w:spacing w:after="110" w:line="300"/>
-        <w:jc w:val="both"/>
-      </w:pPr>
-      <w:r>
-        <w:rPr>
-          <w:rFonts w:ascii="Times New Roman" w:cs="Times New Roman" w:eastAsia="Times New Roman" w:hAnsi="Times New Roman"/>
-          <w:b w:val="false"/>
-          <w:bCs w:val="false"/>
-          <w:i w:val="false"/>
-          <w:iCs w:val="false"/>
-          <w:color w:val="000000"/>
-          <w:sz w:val="24"/>
-          <w:szCs w:val="24"/>
-        </w:rPr>
-        <w:t xml:space="preserve">La machine « double puis ajoute 1 » se décrit en un coup avec la variable x : elle rend 2x + 1. L’écriture 2x signifie 2 × x : on ne met pas le signe × entre un nombre et une lettre. La variable permet d’énoncer des règles générales : le double de x est 2x, le successeur de n est n + 1, la moitié de a est a/2.</w:t>
-      </w:r>
-    </w:p>
-    <w:p>
-      <w:pPr>
         <w:spacing w:after="120" w:before="120"/>
         <w:jc w:val="center"/>
       </w:pPr>
       <w:r>
         <w:drawing>
           <wp:inline distT="0" distB="0" distL="0" distR="0">
-            <wp:extent cx="4762500" cy="1666875"/>
+            <wp:extent cx="4095750" cy="2286000"/>
             <wp:effectExtent t="0" r="0" b="0" l="0"/>
-            <wp:docPr id="5" name="" descr="" title=""/>
+            <wp:docPr id="9" name="" descr="" title=""/>
             <wp:cNvGraphicFramePr>
               <a:graphicFrameLocks xmlns:a="http://schemas.openxmlformats.org/drawingml/2006/main" noChangeAspect="1"/>
             </wp:cNvGraphicFramePr>
@@ -14207,7 +14308,136 @@
                     </pic:cNvPicPr>
                   </pic:nvPicPr>
                   <pic:blipFill>
-                    <a:blip r:embed="rId13" cstate="none"/>
+                    <a:blip r:embed="rId17" cstate="none"/>
+                    <a:srcRect/>
+                    <a:stretch>
+                      <a:fillRect/>
+                    </a:stretch>
+                  </pic:blipFill>
+                  <pic:spPr bwMode="auto">
+                    <a:xfrm>
+                      <a:off x="0" y="0"/>
+                      <a:ext cx="4095750" cy="2286000"/>
+                    </a:xfrm>
+                    <a:prstGeom prst="rect">
+                      <a:avLst/>
+                    </a:prstGeom>
+                  </pic:spPr>
+                </pic:pic>
+              </a:graphicData>
+            </a:graphic>
+          </wp:inline>
+        </w:drawing>
+      </w:r>
+    </w:p>
+    <w:p>
+      <w:pPr>
+        <w:spacing w:after="110" w:line="300"/>
+        <w:jc w:val="both"/>
+      </w:pPr>
+      <w:r>
+        <w:rPr>
+          <w:rFonts w:ascii="Times New Roman" w:cs="Times New Roman" w:eastAsia="Times New Roman" w:hAnsi="Times New Roman"/>
+          <w:b/>
+          <w:bCs/>
+          <w:i w:val="false"/>
+          <w:iCs w:val="false"/>
+          <w:color w:val="2E7D32"/>
+          <w:sz w:val="24"/>
+          <w:szCs w:val="24"/>
+        </w:rPr>
+        <w:t xml:space="preserve">Définition — </w:t>
+      </w:r>
+      <w:r>
+        <w:rPr>
+          <w:rFonts w:ascii="Times New Roman" w:cs="Times New Roman" w:eastAsia="Times New Roman" w:hAnsi="Times New Roman"/>
+          <w:b/>
+          <w:bCs/>
+          <w:i w:val="false"/>
+          <w:iCs w:val="false"/>
+          <w:color w:val="000000"/>
+          <w:sz w:val="24"/>
+          <w:szCs w:val="24"/>
+        </w:rPr>
+        <w:t xml:space="preserve">Une variable est une lettre, comme x, qui représente un nombre pouvant prendre différentes valeurs.</w:t>
+      </w:r>
+    </w:p>
+    <w:p>
+      <w:pPr>
+        <w:spacing w:after="110" w:line="300"/>
+        <w:jc w:val="both"/>
+      </w:pPr>
+      <w:r>
+        <w:rPr>
+          <w:rFonts w:ascii="Times New Roman" w:cs="Times New Roman" w:eastAsia="Times New Roman" w:hAnsi="Times New Roman"/>
+          <w:b/>
+          <w:bCs/>
+          <w:i w:val="false"/>
+          <w:iCs w:val="false"/>
+          <w:color w:val="1F4E79"/>
+          <w:sz w:val="24"/>
+          <w:szCs w:val="24"/>
+        </w:rPr>
+        <w:t xml:space="preserve">Autrement dit : </w:t>
+      </w:r>
+      <w:r>
+        <w:rPr>
+          <w:rFonts w:ascii="Times New Roman" w:cs="Times New Roman" w:eastAsia="Times New Roman" w:hAnsi="Times New Roman"/>
+          <w:b w:val="false"/>
+          <w:bCs w:val="false"/>
+          <w:i w:val="false"/>
+          <w:iCs w:val="false"/>
+          <w:color w:val="000000"/>
+          <w:sz w:val="24"/>
+          <w:szCs w:val="24"/>
+        </w:rPr>
+        <w:t xml:space="preserve">la lettre x est une « case vide » : on peut y glisser 3, 10 ou n’importe quel nombre.</w:t>
+      </w:r>
+    </w:p>
+    <w:p>
+      <w:pPr>
+        <w:spacing w:after="110" w:line="300"/>
+        <w:jc w:val="both"/>
+      </w:pPr>
+      <w:r>
+        <w:rPr>
+          <w:rFonts w:ascii="Times New Roman" w:cs="Times New Roman" w:eastAsia="Times New Roman" w:hAnsi="Times New Roman"/>
+          <w:b w:val="false"/>
+          <w:bCs w:val="false"/>
+          <w:i w:val="false"/>
+          <w:iCs w:val="false"/>
+          <w:color w:val="000000"/>
+          <w:sz w:val="24"/>
+          <w:szCs w:val="24"/>
+        </w:rPr>
+        <w:t xml:space="preserve">La machine « double puis ajoute 1 » se décrit en un coup avec la variable x : elle rend 2x + 1. L’écriture 2x signifie 2 × x : on ne met pas le signe × entre un nombre et une lettre. La variable permet d’énoncer des règles générales : le double de x est 2x, le successeur de n est n + 1, la moitié de a est a/2.</w:t>
+      </w:r>
+    </w:p>
+    <w:p>
+      <w:pPr>
+        <w:spacing w:after="120" w:before="120"/>
+        <w:jc w:val="center"/>
+      </w:pPr>
+      <w:r>
+        <w:drawing>
+          <wp:inline distT="0" distB="0" distL="0" distR="0">
+            <wp:extent cx="4762500" cy="1666875"/>
+            <wp:effectExtent t="0" r="0" b="0" l="0"/>
+            <wp:docPr id="10" name="" descr="" title=""/>
+            <wp:cNvGraphicFramePr>
+              <a:graphicFrameLocks xmlns:a="http://schemas.openxmlformats.org/drawingml/2006/main" noChangeAspect="1"/>
+            </wp:cNvGraphicFramePr>
+            <a:graphic xmlns:a="http://schemas.openxmlformats.org/drawingml/2006/main">
+              <a:graphicData uri="http://schemas.openxmlformats.org/drawingml/2006/picture">
+                <pic:pic xmlns:pic="http://schemas.openxmlformats.org/drawingml/2006/picture">
+                  <pic:nvPicPr>
+                    <pic:cNvPr id="0" name="" descr=""/>
+                    <pic:cNvPicPr>
+                      <a:picLocks noChangeAspect="1" noChangeArrowheads="1"/>
+                    </pic:cNvPicPr>
+                  </pic:nvPicPr>
+                  <pic:blipFill>
+                    <a:blip r:embed="rId18" cstate="none"/>
                     <a:srcRect/>
                     <a:stretch>
                       <a:fillRect/>
@@ -16951,98 +17181,15 @@
     </w:p>
     <w:p>
       <w:pPr>
-        <w:spacing w:after="110" w:line="300"/>
-        <w:jc w:val="both"/>
-      </w:pPr>
-      <w:r>
-        <w:rPr>
-          <w:rFonts w:ascii="Times New Roman" w:cs="Times New Roman" w:eastAsia="Times New Roman" w:hAnsi="Times New Roman"/>
-          <w:b/>
-          <w:bCs/>
-          <w:i w:val="false"/>
-          <w:iCs w:val="false"/>
-          <w:color w:val="2E7D32"/>
-          <w:sz w:val="24"/>
-          <w:szCs w:val="24"/>
-        </w:rPr>
-        <w:t xml:space="preserve">Définition — </w:t>
-      </w:r>
-      <w:r>
-        <w:rPr>
-          <w:rFonts w:ascii="Times New Roman" w:cs="Times New Roman" w:eastAsia="Times New Roman" w:hAnsi="Times New Roman"/>
-          <w:b/>
-          <w:bCs/>
-          <w:i w:val="false"/>
-          <w:iCs w:val="false"/>
-          <w:color w:val="000000"/>
-          <w:sz w:val="24"/>
-          <w:szCs w:val="24"/>
-        </w:rPr>
-        <w:t xml:space="preserve">Une expression littérale est une écriture mathématique qui contient une ou plusieurs lettres. Une formule est une expression littérale qui donne une grandeur en fonction d’autres : P = 4c pour le périmètre du carré.</w:t>
-      </w:r>
-    </w:p>
-    <w:p>
-      <w:pPr>
-        <w:spacing w:after="110" w:line="300"/>
-        <w:jc w:val="both"/>
-      </w:pPr>
-      <w:r>
-        <w:rPr>
-          <w:rFonts w:ascii="Times New Roman" w:cs="Times New Roman" w:eastAsia="Times New Roman" w:hAnsi="Times New Roman"/>
-          <w:b/>
-          <w:bCs/>
-          <w:i w:val="false"/>
-          <w:iCs w:val="false"/>
-          <w:color w:val="1F4E79"/>
-          <w:sz w:val="24"/>
-          <w:szCs w:val="24"/>
-        </w:rPr>
-        <w:t xml:space="preserve">Autrement dit : </w:t>
-      </w:r>
-      <w:r>
-        <w:rPr>
-          <w:rFonts w:ascii="Times New Roman" w:cs="Times New Roman" w:eastAsia="Times New Roman" w:hAnsi="Times New Roman"/>
-          <w:b w:val="false"/>
-          <w:bCs w:val="false"/>
-          <w:i w:val="false"/>
-          <w:iCs w:val="false"/>
-          <w:color w:val="000000"/>
-          <w:sz w:val="24"/>
-          <w:szCs w:val="24"/>
-        </w:rPr>
-        <w:t xml:space="preserve">la formule est une recette : on y range le calcul une fois pour toutes, et elle sert pour tous les carrés du monde.</w:t>
-      </w:r>
-    </w:p>
-    <w:p>
-      <w:pPr>
-        <w:spacing w:after="110" w:line="300"/>
-        <w:jc w:val="both"/>
-      </w:pPr>
-      <w:r>
-        <w:rPr>
-          <w:rFonts w:ascii="Times New Roman" w:cs="Times New Roman" w:eastAsia="Times New Roman" w:hAnsi="Times New Roman"/>
-          <w:b w:val="false"/>
-          <w:bCs w:val="false"/>
-          <w:i w:val="false"/>
-          <w:iCs w:val="false"/>
-          <w:color w:val="000000"/>
-          <w:sz w:val="24"/>
-          <w:szCs w:val="24"/>
-        </w:rPr>
-        <w:t xml:space="preserve">Le périmètre du carré de côté c : P = c + c + c + c = 4c. Celui du rectangle : P = 2(L + l). Un programme de calcul se traduit pas à pas : « choisir un nombre, le multiplier par 3, enlever 2 » devient 3x − 2. En sens inverse, lire une formule, c’est retrouver le programme qu’elle décrit.</w:t>
-      </w:r>
-    </w:p>
-    <w:p>
-      <w:pPr>
         <w:spacing w:after="120" w:before="120"/>
         <w:jc w:val="center"/>
       </w:pPr>
       <w:r>
         <w:drawing>
           <wp:inline distT="0" distB="0" distL="0" distR="0">
-            <wp:extent cx="4762500" cy="1876425"/>
+            <wp:extent cx="4095750" cy="2286000"/>
             <wp:effectExtent t="0" r="0" b="0" l="0"/>
-            <wp:docPr id="6" name="" descr="" title=""/>
+            <wp:docPr id="11" name="" descr="" title=""/>
             <wp:cNvGraphicFramePr>
               <a:graphicFrameLocks xmlns:a="http://schemas.openxmlformats.org/drawingml/2006/main" noChangeAspect="1"/>
             </wp:cNvGraphicFramePr>
@@ -17056,7 +17203,136 @@
                     </pic:cNvPicPr>
                   </pic:nvPicPr>
                   <pic:blipFill>
-                    <a:blip r:embed="rId14" cstate="none"/>
+                    <a:blip r:embed="rId19" cstate="none"/>
+                    <a:srcRect/>
+                    <a:stretch>
+                      <a:fillRect/>
+                    </a:stretch>
+                  </pic:blipFill>
+                  <pic:spPr bwMode="auto">
+                    <a:xfrm>
+                      <a:off x="0" y="0"/>
+                      <a:ext cx="4095750" cy="2286000"/>
+                    </a:xfrm>
+                    <a:prstGeom prst="rect">
+                      <a:avLst/>
+                    </a:prstGeom>
+                  </pic:spPr>
+                </pic:pic>
+              </a:graphicData>
+            </a:graphic>
+          </wp:inline>
+        </w:drawing>
+      </w:r>
+    </w:p>
+    <w:p>
+      <w:pPr>
+        <w:spacing w:after="110" w:line="300"/>
+        <w:jc w:val="both"/>
+      </w:pPr>
+      <w:r>
+        <w:rPr>
+          <w:rFonts w:ascii="Times New Roman" w:cs="Times New Roman" w:eastAsia="Times New Roman" w:hAnsi="Times New Roman"/>
+          <w:b/>
+          <w:bCs/>
+          <w:i w:val="false"/>
+          <w:iCs w:val="false"/>
+          <w:color w:val="2E7D32"/>
+          <w:sz w:val="24"/>
+          <w:szCs w:val="24"/>
+        </w:rPr>
+        <w:t xml:space="preserve">Définition — </w:t>
+      </w:r>
+      <w:r>
+        <w:rPr>
+          <w:rFonts w:ascii="Times New Roman" w:cs="Times New Roman" w:eastAsia="Times New Roman" w:hAnsi="Times New Roman"/>
+          <w:b/>
+          <w:bCs/>
+          <w:i w:val="false"/>
+          <w:iCs w:val="false"/>
+          <w:color w:val="000000"/>
+          <w:sz w:val="24"/>
+          <w:szCs w:val="24"/>
+        </w:rPr>
+        <w:t xml:space="preserve">Une expression littérale est une écriture mathématique qui contient une ou plusieurs lettres. Une formule est une expression littérale qui donne une grandeur en fonction d’autres : P = 4c pour le périmètre du carré.</w:t>
+      </w:r>
+    </w:p>
+    <w:p>
+      <w:pPr>
+        <w:spacing w:after="110" w:line="300"/>
+        <w:jc w:val="both"/>
+      </w:pPr>
+      <w:r>
+        <w:rPr>
+          <w:rFonts w:ascii="Times New Roman" w:cs="Times New Roman" w:eastAsia="Times New Roman" w:hAnsi="Times New Roman"/>
+          <w:b/>
+          <w:bCs/>
+          <w:i w:val="false"/>
+          <w:iCs w:val="false"/>
+          <w:color w:val="1F4E79"/>
+          <w:sz w:val="24"/>
+          <w:szCs w:val="24"/>
+        </w:rPr>
+        <w:t xml:space="preserve">Autrement dit : </w:t>
+      </w:r>
+      <w:r>
+        <w:rPr>
+          <w:rFonts w:ascii="Times New Roman" w:cs="Times New Roman" w:eastAsia="Times New Roman" w:hAnsi="Times New Roman"/>
+          <w:b w:val="false"/>
+          <w:bCs w:val="false"/>
+          <w:i w:val="false"/>
+          <w:iCs w:val="false"/>
+          <w:color w:val="000000"/>
+          <w:sz w:val="24"/>
+          <w:szCs w:val="24"/>
+        </w:rPr>
+        <w:t xml:space="preserve">la formule est une recette : on y range le calcul une fois pour toutes, et elle sert pour tous les carrés du monde.</w:t>
+      </w:r>
+    </w:p>
+    <w:p>
+      <w:pPr>
+        <w:spacing w:after="110" w:line="300"/>
+        <w:jc w:val="both"/>
+      </w:pPr>
+      <w:r>
+        <w:rPr>
+          <w:rFonts w:ascii="Times New Roman" w:cs="Times New Roman" w:eastAsia="Times New Roman" w:hAnsi="Times New Roman"/>
+          <w:b w:val="false"/>
+          <w:bCs w:val="false"/>
+          <w:i w:val="false"/>
+          <w:iCs w:val="false"/>
+          <w:color w:val="000000"/>
+          <w:sz w:val="24"/>
+          <w:szCs w:val="24"/>
+        </w:rPr>
+        <w:t xml:space="preserve">Le périmètre du carré de côté c : P = c + c + c + c = 4c. Celui du rectangle : P = 2(L + l). Un programme de calcul se traduit pas à pas : « choisir un nombre, le multiplier par 3, enlever 2 » devient 3x − 2. En sens inverse, lire une formule, c’est retrouver le programme qu’elle décrit.</w:t>
+      </w:r>
+    </w:p>
+    <w:p>
+      <w:pPr>
+        <w:spacing w:after="120" w:before="120"/>
+        <w:jc w:val="center"/>
+      </w:pPr>
+      <w:r>
+        <w:drawing>
+          <wp:inline distT="0" distB="0" distL="0" distR="0">
+            <wp:extent cx="4762500" cy="1876425"/>
+            <wp:effectExtent t="0" r="0" b="0" l="0"/>
+            <wp:docPr id="12" name="" descr="" title=""/>
+            <wp:cNvGraphicFramePr>
+              <a:graphicFrameLocks xmlns:a="http://schemas.openxmlformats.org/drawingml/2006/main" noChangeAspect="1"/>
+            </wp:cNvGraphicFramePr>
+            <a:graphic xmlns:a="http://schemas.openxmlformats.org/drawingml/2006/main">
+              <a:graphicData uri="http://schemas.openxmlformats.org/drawingml/2006/picture">
+                <pic:pic xmlns:pic="http://schemas.openxmlformats.org/drawingml/2006/picture">
+                  <pic:nvPicPr>
+                    <pic:cNvPr id="0" name="" descr=""/>
+                    <pic:cNvPicPr>
+                      <a:picLocks noChangeAspect="1" noChangeArrowheads="1"/>
+                    </pic:cNvPicPr>
+                  </pic:nvPicPr>
+                  <pic:blipFill>
+                    <a:blip r:embed="rId20" cstate="none"/>
                     <a:srcRect/>
                     <a:stretch>
                       <a:fillRect/>
@@ -19800,98 +20076,15 @@
     </w:p>
     <w:p>
       <w:pPr>
-        <w:spacing w:after="110" w:line="300"/>
-        <w:jc w:val="both"/>
-      </w:pPr>
-      <w:r>
-        <w:rPr>
-          <w:rFonts w:ascii="Times New Roman" w:cs="Times New Roman" w:eastAsia="Times New Roman" w:hAnsi="Times New Roman"/>
-          <w:b/>
-          <w:bCs/>
-          <w:i w:val="false"/>
-          <w:iCs w:val="false"/>
-          <w:color w:val="2E7D32"/>
-          <w:sz w:val="24"/>
-          <w:szCs w:val="24"/>
-        </w:rPr>
-        <w:t xml:space="preserve">Définition — </w:t>
-      </w:r>
-      <w:r>
-        <w:rPr>
-          <w:rFonts w:ascii="Times New Roman" w:cs="Times New Roman" w:eastAsia="Times New Roman" w:hAnsi="Times New Roman"/>
-          <w:b/>
-          <w:bCs/>
-          <w:i w:val="false"/>
-          <w:iCs w:val="false"/>
-          <w:color w:val="000000"/>
-          <w:sz w:val="24"/>
-          <w:szCs w:val="24"/>
-        </w:rPr>
-        <w:t xml:space="preserve">Deux grandeurs x et y sont proportionnelles lorsqu’on passe de x à y en multipliant toujours par un même nombre a, appelé coefficient de proportionnalité : y = a × x.</w:t>
-      </w:r>
-    </w:p>
-    <w:p>
-      <w:pPr>
-        <w:spacing w:after="110" w:line="300"/>
-        <w:jc w:val="both"/>
-      </w:pPr>
-      <w:r>
-        <w:rPr>
-          <w:rFonts w:ascii="Times New Roman" w:cs="Times New Roman" w:eastAsia="Times New Roman" w:hAnsi="Times New Roman"/>
-          <w:b/>
-          <w:bCs/>
-          <w:i w:val="false"/>
-          <w:iCs w:val="false"/>
-          <w:color w:val="1F4E79"/>
-          <w:sz w:val="24"/>
-          <w:szCs w:val="24"/>
-        </w:rPr>
-        <w:t xml:space="preserve">Autrement dit : </w:t>
-      </w:r>
-      <w:r>
-        <w:rPr>
-          <w:rFonts w:ascii="Times New Roman" w:cs="Times New Roman" w:eastAsia="Times New Roman" w:hAnsi="Times New Roman"/>
-          <w:b w:val="false"/>
-          <w:bCs w:val="false"/>
-          <w:i w:val="false"/>
-          <w:iCs w:val="false"/>
-          <w:color w:val="000000"/>
-          <w:sz w:val="24"/>
-          <w:szCs w:val="24"/>
-        </w:rPr>
-        <w:t xml:space="preserve">la formule y = 650x contient tout le tableau des prix du riz : elle marche pour 1 kg, 2 kg, 3 kg… et même 2,5 kg !</w:t>
-      </w:r>
-    </w:p>
-    <w:p>
-      <w:pPr>
-        <w:spacing w:after="110" w:line="300"/>
-        <w:jc w:val="both"/>
-      </w:pPr>
-      <w:r>
-        <w:rPr>
-          <w:rFonts w:ascii="Times New Roman" w:cs="Times New Roman" w:eastAsia="Times New Roman" w:hAnsi="Times New Roman"/>
-          <w:b w:val="false"/>
-          <w:bCs w:val="false"/>
-          <w:i w:val="false"/>
-          <w:iCs w:val="false"/>
-          <w:color w:val="000000"/>
-          <w:sz w:val="24"/>
-          <w:szCs w:val="24"/>
-        </w:rPr>
-        <w:t xml:space="preserve">Dans le tableau du riz, chaque prix vaut 650 fois la masse : le coefficient est a = 650 et la relation s’écrit y = 650x. Pour trouver a, on divise une valeur de y par la valeur de x correspondante : a = 1 300 ÷ 2 = 650. La relation permet de prédire sans tableau : pour x = 7, y = 650 × 7 = 4 550 Ar.</w:t>
-      </w:r>
-    </w:p>
-    <w:p>
-      <w:pPr>
         <w:spacing w:after="120" w:before="120"/>
         <w:jc w:val="center"/>
       </w:pPr>
       <w:r>
         <w:drawing>
           <wp:inline distT="0" distB="0" distL="0" distR="0">
-            <wp:extent cx="4762500" cy="2019300"/>
+            <wp:extent cx="4095750" cy="2286000"/>
             <wp:effectExtent t="0" r="0" b="0" l="0"/>
-            <wp:docPr id="7" name="" descr="" title=""/>
+            <wp:docPr id="13" name="" descr="" title=""/>
             <wp:cNvGraphicFramePr>
               <a:graphicFrameLocks xmlns:a="http://schemas.openxmlformats.org/drawingml/2006/main" noChangeAspect="1"/>
             </wp:cNvGraphicFramePr>
@@ -19905,7 +20098,136 @@
                     </pic:cNvPicPr>
                   </pic:nvPicPr>
                   <pic:blipFill>
-                    <a:blip r:embed="rId15" cstate="none"/>
+                    <a:blip r:embed="rId21" cstate="none"/>
+                    <a:srcRect/>
+                    <a:stretch>
+                      <a:fillRect/>
+                    </a:stretch>
+                  </pic:blipFill>
+                  <pic:spPr bwMode="auto">
+                    <a:xfrm>
+                      <a:off x="0" y="0"/>
+                      <a:ext cx="4095750" cy="2286000"/>
+                    </a:xfrm>
+                    <a:prstGeom prst="rect">
+                      <a:avLst/>
+                    </a:prstGeom>
+                  </pic:spPr>
+                </pic:pic>
+              </a:graphicData>
+            </a:graphic>
+          </wp:inline>
+        </w:drawing>
+      </w:r>
+    </w:p>
+    <w:p>
+      <w:pPr>
+        <w:spacing w:after="110" w:line="300"/>
+        <w:jc w:val="both"/>
+      </w:pPr>
+      <w:r>
+        <w:rPr>
+          <w:rFonts w:ascii="Times New Roman" w:cs="Times New Roman" w:eastAsia="Times New Roman" w:hAnsi="Times New Roman"/>
+          <w:b/>
+          <w:bCs/>
+          <w:i w:val="false"/>
+          <w:iCs w:val="false"/>
+          <w:color w:val="2E7D32"/>
+          <w:sz w:val="24"/>
+          <w:szCs w:val="24"/>
+        </w:rPr>
+        <w:t xml:space="preserve">Définition — </w:t>
+      </w:r>
+      <w:r>
+        <w:rPr>
+          <w:rFonts w:ascii="Times New Roman" w:cs="Times New Roman" w:eastAsia="Times New Roman" w:hAnsi="Times New Roman"/>
+          <w:b/>
+          <w:bCs/>
+          <w:i w:val="false"/>
+          <w:iCs w:val="false"/>
+          <w:color w:val="000000"/>
+          <w:sz w:val="24"/>
+          <w:szCs w:val="24"/>
+        </w:rPr>
+        <w:t xml:space="preserve">Deux grandeurs x et y sont proportionnelles lorsqu’on passe de x à y en multipliant toujours par un même nombre a, appelé coefficient de proportionnalité : y = a × x.</w:t>
+      </w:r>
+    </w:p>
+    <w:p>
+      <w:pPr>
+        <w:spacing w:after="110" w:line="300"/>
+        <w:jc w:val="both"/>
+      </w:pPr>
+      <w:r>
+        <w:rPr>
+          <w:rFonts w:ascii="Times New Roman" w:cs="Times New Roman" w:eastAsia="Times New Roman" w:hAnsi="Times New Roman"/>
+          <w:b/>
+          <w:bCs/>
+          <w:i w:val="false"/>
+          <w:iCs w:val="false"/>
+          <w:color w:val="1F4E79"/>
+          <w:sz w:val="24"/>
+          <w:szCs w:val="24"/>
+        </w:rPr>
+        <w:t xml:space="preserve">Autrement dit : </w:t>
+      </w:r>
+      <w:r>
+        <w:rPr>
+          <w:rFonts w:ascii="Times New Roman" w:cs="Times New Roman" w:eastAsia="Times New Roman" w:hAnsi="Times New Roman"/>
+          <w:b w:val="false"/>
+          <w:bCs w:val="false"/>
+          <w:i w:val="false"/>
+          <w:iCs w:val="false"/>
+          <w:color w:val="000000"/>
+          <w:sz w:val="24"/>
+          <w:szCs w:val="24"/>
+        </w:rPr>
+        <w:t xml:space="preserve">la formule y = 650x contient tout le tableau des prix du riz : elle marche pour 1 kg, 2 kg, 3 kg… et même 2,5 kg !</w:t>
+      </w:r>
+    </w:p>
+    <w:p>
+      <w:pPr>
+        <w:spacing w:after="110" w:line="300"/>
+        <w:jc w:val="both"/>
+      </w:pPr>
+      <w:r>
+        <w:rPr>
+          <w:rFonts w:ascii="Times New Roman" w:cs="Times New Roman" w:eastAsia="Times New Roman" w:hAnsi="Times New Roman"/>
+          <w:b w:val="false"/>
+          <w:bCs w:val="false"/>
+          <w:i w:val="false"/>
+          <w:iCs w:val="false"/>
+          <w:color w:val="000000"/>
+          <w:sz w:val="24"/>
+          <w:szCs w:val="24"/>
+        </w:rPr>
+        <w:t xml:space="preserve">Dans le tableau du riz, chaque prix vaut 650 fois la masse : le coefficient est a = 650 et la relation s’écrit y = 650x. Pour trouver a, on divise une valeur de y par la valeur de x correspondante : a = 1 300 ÷ 2 = 650. La relation permet de prédire sans tableau : pour x = 7, y = 650 × 7 = 4 550 Ar.</w:t>
+      </w:r>
+    </w:p>
+    <w:p>
+      <w:pPr>
+        <w:spacing w:after="120" w:before="120"/>
+        <w:jc w:val="center"/>
+      </w:pPr>
+      <w:r>
+        <w:drawing>
+          <wp:inline distT="0" distB="0" distL="0" distR="0">
+            <wp:extent cx="4762500" cy="2019300"/>
+            <wp:effectExtent t="0" r="0" b="0" l="0"/>
+            <wp:docPr id="14" name="" descr="" title=""/>
+            <wp:cNvGraphicFramePr>
+              <a:graphicFrameLocks xmlns:a="http://schemas.openxmlformats.org/drawingml/2006/main" noChangeAspect="1"/>
+            </wp:cNvGraphicFramePr>
+            <a:graphic xmlns:a="http://schemas.openxmlformats.org/drawingml/2006/main">
+              <a:graphicData uri="http://schemas.openxmlformats.org/drawingml/2006/picture">
+                <pic:pic xmlns:pic="http://schemas.openxmlformats.org/drawingml/2006/picture">
+                  <pic:nvPicPr>
+                    <pic:cNvPr id="0" name="" descr=""/>
+                    <pic:cNvPicPr>
+                      <a:picLocks noChangeAspect="1" noChangeArrowheads="1"/>
+                    </pic:cNvPicPr>
+                  </pic:nvPicPr>
+                  <pic:blipFill>
+                    <a:blip r:embed="rId22" cstate="none"/>
                     <a:srcRect/>
                     <a:stretch>
                       <a:fillRect/>
@@ -22649,98 +22971,15 @@
     </w:p>
     <w:p>
       <w:pPr>
-        <w:spacing w:after="110" w:line="300"/>
-        <w:jc w:val="both"/>
-      </w:pPr>
-      <w:r>
-        <w:rPr>
-          <w:rFonts w:ascii="Times New Roman" w:cs="Times New Roman" w:eastAsia="Times New Roman" w:hAnsi="Times New Roman"/>
-          <w:b/>
-          <w:bCs/>
-          <w:i w:val="false"/>
-          <w:iCs w:val="false"/>
-          <w:color w:val="2E7D32"/>
-          <w:sz w:val="24"/>
-          <w:szCs w:val="24"/>
-        </w:rPr>
-        <w:t xml:space="preserve">Définition — </w:t>
-      </w:r>
-      <w:r>
-        <w:rPr>
-          <w:rFonts w:ascii="Times New Roman" w:cs="Times New Roman" w:eastAsia="Times New Roman" w:hAnsi="Times New Roman"/>
-          <w:b/>
-          <w:bCs/>
-          <w:i w:val="false"/>
-          <w:iCs w:val="false"/>
-          <w:color w:val="000000"/>
-          <w:sz w:val="24"/>
-          <w:szCs w:val="24"/>
-        </w:rPr>
-        <w:t xml:space="preserve">Une égalité reste vraie lorsqu’on ajoute, soustrait, multiplie ou divise ses deux membres par un même nombre (non nul pour la division).</w:t>
-      </w:r>
-    </w:p>
-    <w:p>
-      <w:pPr>
-        <w:spacing w:after="110" w:line="300"/>
-        <w:jc w:val="both"/>
-      </w:pPr>
-      <w:r>
-        <w:rPr>
-          <w:rFonts w:ascii="Times New Roman" w:cs="Times New Roman" w:eastAsia="Times New Roman" w:hAnsi="Times New Roman"/>
-          <w:b/>
-          <w:bCs/>
-          <w:i w:val="false"/>
-          <w:iCs w:val="false"/>
-          <w:color w:val="1F4E79"/>
-          <w:sz w:val="24"/>
-          <w:szCs w:val="24"/>
-        </w:rPr>
-        <w:t xml:space="preserve">Autrement dit : </w:t>
-      </w:r>
-      <w:r>
-        <w:rPr>
-          <w:rFonts w:ascii="Times New Roman" w:cs="Times New Roman" w:eastAsia="Times New Roman" w:hAnsi="Times New Roman"/>
-          <w:b w:val="false"/>
-          <w:bCs w:val="false"/>
-          <w:i w:val="false"/>
-          <w:iCs w:val="false"/>
-          <w:color w:val="000000"/>
-          <w:sz w:val="24"/>
-          <w:szCs w:val="24"/>
-        </w:rPr>
-        <w:t xml:space="preserve">l’égalité est une balance : tout ce qu’on fait à gauche, on doit le faire aussi à droite.</w:t>
-      </w:r>
-    </w:p>
-    <w:p>
-      <w:pPr>
-        <w:spacing w:after="110" w:line="300"/>
-        <w:jc w:val="both"/>
-      </w:pPr>
-      <w:r>
-        <w:rPr>
-          <w:rFonts w:ascii="Times New Roman" w:cs="Times New Roman" w:eastAsia="Times New Roman" w:hAnsi="Times New Roman"/>
-          <w:b w:val="false"/>
-          <w:bCs w:val="false"/>
-          <w:i w:val="false"/>
-          <w:iCs w:val="false"/>
-          <w:color w:val="000000"/>
-          <w:sz w:val="24"/>
-          <w:szCs w:val="24"/>
-        </w:rPr>
-        <w:t xml:space="preserve">Si x + 3 = 10, enlever 3 des deux côtés conserve l’équilibre : x = 7. Si 5x = 35, diviser les deux membres par 5 donne x = 7. Ces transformations autorisées sont l’outil central de la résolution d’équations : elles isolent peu à peu la lettre inconnue.</w:t>
-      </w:r>
-    </w:p>
-    <w:p>
-      <w:pPr>
         <w:spacing w:after="120" w:before="120"/>
         <w:jc w:val="center"/>
       </w:pPr>
       <w:r>
         <w:drawing>
           <wp:inline distT="0" distB="0" distL="0" distR="0">
-            <wp:extent cx="4762500" cy="1971675"/>
+            <wp:extent cx="4095750" cy="2286000"/>
             <wp:effectExtent t="0" r="0" b="0" l="0"/>
-            <wp:docPr id="8" name="" descr="" title=""/>
+            <wp:docPr id="15" name="" descr="" title=""/>
             <wp:cNvGraphicFramePr>
               <a:graphicFrameLocks xmlns:a="http://schemas.openxmlformats.org/drawingml/2006/main" noChangeAspect="1"/>
             </wp:cNvGraphicFramePr>
@@ -22754,7 +22993,136 @@
                     </pic:cNvPicPr>
                   </pic:nvPicPr>
                   <pic:blipFill>
-                    <a:blip r:embed="rId16" cstate="none"/>
+                    <a:blip r:embed="rId23" cstate="none"/>
+                    <a:srcRect/>
+                    <a:stretch>
+                      <a:fillRect/>
+                    </a:stretch>
+                  </pic:blipFill>
+                  <pic:spPr bwMode="auto">
+                    <a:xfrm>
+                      <a:off x="0" y="0"/>
+                      <a:ext cx="4095750" cy="2286000"/>
+                    </a:xfrm>
+                    <a:prstGeom prst="rect">
+                      <a:avLst/>
+                    </a:prstGeom>
+                  </pic:spPr>
+                </pic:pic>
+              </a:graphicData>
+            </a:graphic>
+          </wp:inline>
+        </w:drawing>
+      </w:r>
+    </w:p>
+    <w:p>
+      <w:pPr>
+        <w:spacing w:after="110" w:line="300"/>
+        <w:jc w:val="both"/>
+      </w:pPr>
+      <w:r>
+        <w:rPr>
+          <w:rFonts w:ascii="Times New Roman" w:cs="Times New Roman" w:eastAsia="Times New Roman" w:hAnsi="Times New Roman"/>
+          <w:b/>
+          <w:bCs/>
+          <w:i w:val="false"/>
+          <w:iCs w:val="false"/>
+          <w:color w:val="2E7D32"/>
+          <w:sz w:val="24"/>
+          <w:szCs w:val="24"/>
+        </w:rPr>
+        <w:t xml:space="preserve">Définition — </w:t>
+      </w:r>
+      <w:r>
+        <w:rPr>
+          <w:rFonts w:ascii="Times New Roman" w:cs="Times New Roman" w:eastAsia="Times New Roman" w:hAnsi="Times New Roman"/>
+          <w:b/>
+          <w:bCs/>
+          <w:i w:val="false"/>
+          <w:iCs w:val="false"/>
+          <w:color w:val="000000"/>
+          <w:sz w:val="24"/>
+          <w:szCs w:val="24"/>
+        </w:rPr>
+        <w:t xml:space="preserve">Une égalité reste vraie lorsqu’on ajoute, soustrait, multiplie ou divise ses deux membres par un même nombre (non nul pour la division).</w:t>
+      </w:r>
+    </w:p>
+    <w:p>
+      <w:pPr>
+        <w:spacing w:after="110" w:line="300"/>
+        <w:jc w:val="both"/>
+      </w:pPr>
+      <w:r>
+        <w:rPr>
+          <w:rFonts w:ascii="Times New Roman" w:cs="Times New Roman" w:eastAsia="Times New Roman" w:hAnsi="Times New Roman"/>
+          <w:b/>
+          <w:bCs/>
+          <w:i w:val="false"/>
+          <w:iCs w:val="false"/>
+          <w:color w:val="1F4E79"/>
+          <w:sz w:val="24"/>
+          <w:szCs w:val="24"/>
+        </w:rPr>
+        <w:t xml:space="preserve">Autrement dit : </w:t>
+      </w:r>
+      <w:r>
+        <w:rPr>
+          <w:rFonts w:ascii="Times New Roman" w:cs="Times New Roman" w:eastAsia="Times New Roman" w:hAnsi="Times New Roman"/>
+          <w:b w:val="false"/>
+          <w:bCs w:val="false"/>
+          <w:i w:val="false"/>
+          <w:iCs w:val="false"/>
+          <w:color w:val="000000"/>
+          <w:sz w:val="24"/>
+          <w:szCs w:val="24"/>
+        </w:rPr>
+        <w:t xml:space="preserve">l’égalité est une balance : tout ce qu’on fait à gauche, on doit le faire aussi à droite.</w:t>
+      </w:r>
+    </w:p>
+    <w:p>
+      <w:pPr>
+        <w:spacing w:after="110" w:line="300"/>
+        <w:jc w:val="both"/>
+      </w:pPr>
+      <w:r>
+        <w:rPr>
+          <w:rFonts w:ascii="Times New Roman" w:cs="Times New Roman" w:eastAsia="Times New Roman" w:hAnsi="Times New Roman"/>
+          <w:b w:val="false"/>
+          <w:bCs w:val="false"/>
+          <w:i w:val="false"/>
+          <w:iCs w:val="false"/>
+          <w:color w:val="000000"/>
+          <w:sz w:val="24"/>
+          <w:szCs w:val="24"/>
+        </w:rPr>
+        <w:t xml:space="preserve">Si x + 3 = 10, enlever 3 des deux côtés conserve l’équilibre : x = 7. Si 5x = 35, diviser les deux membres par 5 donne x = 7. Ces transformations autorisées sont l’outil central de la résolution d’équations : elles isolent peu à peu la lettre inconnue.</w:t>
+      </w:r>
+    </w:p>
+    <w:p>
+      <w:pPr>
+        <w:spacing w:after="120" w:before="120"/>
+        <w:jc w:val="center"/>
+      </w:pPr>
+      <w:r>
+        <w:drawing>
+          <wp:inline distT="0" distB="0" distL="0" distR="0">
+            <wp:extent cx="4762500" cy="1971675"/>
+            <wp:effectExtent t="0" r="0" b="0" l="0"/>
+            <wp:docPr id="16" name="" descr="" title=""/>
+            <wp:cNvGraphicFramePr>
+              <a:graphicFrameLocks xmlns:a="http://schemas.openxmlformats.org/drawingml/2006/main" noChangeAspect="1"/>
+            </wp:cNvGraphicFramePr>
+            <a:graphic xmlns:a="http://schemas.openxmlformats.org/drawingml/2006/main">
+              <a:graphicData uri="http://schemas.openxmlformats.org/drawingml/2006/picture">
+                <pic:pic xmlns:pic="http://schemas.openxmlformats.org/drawingml/2006/picture">
+                  <pic:nvPicPr>
+                    <pic:cNvPr id="0" name="" descr=""/>
+                    <pic:cNvPicPr>
+                      <a:picLocks noChangeAspect="1" noChangeArrowheads="1"/>
+                    </pic:cNvPicPr>
+                  </pic:nvPicPr>
+                  <pic:blipFill>
+                    <a:blip r:embed="rId24" cstate="none"/>
                     <a:srcRect/>
                     <a:stretch>
                       <a:fillRect/>
@@ -25498,98 +25866,15 @@
     </w:p>
     <w:p>
       <w:pPr>
-        <w:spacing w:after="110" w:line="300"/>
-        <w:jc w:val="both"/>
-      </w:pPr>
-      <w:r>
-        <w:rPr>
-          <w:rFonts w:ascii="Times New Roman" w:cs="Times New Roman" w:eastAsia="Times New Roman" w:hAnsi="Times New Roman"/>
-          <w:b/>
-          <w:bCs/>
-          <w:i w:val="false"/>
-          <w:iCs w:val="false"/>
-          <w:color w:val="2E7D32"/>
-          <w:sz w:val="24"/>
-          <w:szCs w:val="24"/>
-        </w:rPr>
-        <w:t xml:space="preserve">Définition — </w:t>
-      </w:r>
-      <w:r>
-        <w:rPr>
-          <w:rFonts w:ascii="Times New Roman" w:cs="Times New Roman" w:eastAsia="Times New Roman" w:hAnsi="Times New Roman"/>
-          <w:b/>
-          <w:bCs/>
-          <w:i w:val="false"/>
-          <w:iCs w:val="false"/>
-          <w:color w:val="000000"/>
-          <w:sz w:val="24"/>
-          <w:szCs w:val="24"/>
-        </w:rPr>
-        <w:t xml:space="preserve">Une équation du premier degré est une égalité contenant une inconnue (souvent x) dont la puissance est 1. Résoudre l’équation, c’est trouver la valeur de l’inconnue qui rend l’égalité vraie.</w:t>
-      </w:r>
-    </w:p>
-    <w:p>
-      <w:pPr>
-        <w:spacing w:after="110" w:line="300"/>
-        <w:jc w:val="both"/>
-      </w:pPr>
-      <w:r>
-        <w:rPr>
-          <w:rFonts w:ascii="Times New Roman" w:cs="Times New Roman" w:eastAsia="Times New Roman" w:hAnsi="Times New Roman"/>
-          <w:b/>
-          <w:bCs/>
-          <w:i w:val="false"/>
-          <w:iCs w:val="false"/>
-          <w:color w:val="1F4E79"/>
-          <w:sz w:val="24"/>
-          <w:szCs w:val="24"/>
-        </w:rPr>
-        <w:t xml:space="preserve">Autrement dit : </w:t>
-      </w:r>
-      <w:r>
-        <w:rPr>
-          <w:rFonts w:ascii="Times New Roman" w:cs="Times New Roman" w:eastAsia="Times New Roman" w:hAnsi="Times New Roman"/>
-          <w:b w:val="false"/>
-          <w:bCs w:val="false"/>
-          <w:i w:val="false"/>
-          <w:iCs w:val="false"/>
-          <w:color w:val="000000"/>
-          <w:sz w:val="24"/>
-          <w:szCs w:val="24"/>
-        </w:rPr>
-        <w:t xml:space="preserve">l’équation est une devinette : « quel nombre, multiplié par 3 puis augmenté de 5, donne 26 ? ». La solution est la réponse.</w:t>
-      </w:r>
-    </w:p>
-    <w:p>
-      <w:pPr>
-        <w:spacing w:after="110" w:line="300"/>
-        <w:jc w:val="both"/>
-      </w:pPr>
-      <w:r>
-        <w:rPr>
-          <w:rFonts w:ascii="Times New Roman" w:cs="Times New Roman" w:eastAsia="Times New Roman" w:hAnsi="Times New Roman"/>
-          <w:b w:val="false"/>
-          <w:bCs w:val="false"/>
-          <w:i w:val="false"/>
-          <w:iCs w:val="false"/>
-          <w:color w:val="000000"/>
-          <w:sz w:val="24"/>
-          <w:szCs w:val="24"/>
-        </w:rPr>
-        <w:t xml:space="preserve">Pour résoudre 3x + 5 = 26, on isole x en deux étapes : d’abord enlever 5 des deux côtés (3x = 21), puis diviser par 3 (x = 7). On vérifie toujours : 3 × 7 + 5 = 26 ✓. On défait les opérations dans l’ordre inverse du programme de calcul : le + 5 est enlevé avant le × 3.</w:t>
-      </w:r>
-    </w:p>
-    <w:p>
-      <w:pPr>
         <w:spacing w:after="120" w:before="120"/>
         <w:jc w:val="center"/>
       </w:pPr>
       <w:r>
         <w:drawing>
           <wp:inline distT="0" distB="0" distL="0" distR="0">
-            <wp:extent cx="4762500" cy="2076450"/>
+            <wp:extent cx="4095750" cy="2286000"/>
             <wp:effectExtent t="0" r="0" b="0" l="0"/>
-            <wp:docPr id="9" name="" descr="" title=""/>
+            <wp:docPr id="17" name="" descr="" title=""/>
             <wp:cNvGraphicFramePr>
               <a:graphicFrameLocks xmlns:a="http://schemas.openxmlformats.org/drawingml/2006/main" noChangeAspect="1"/>
             </wp:cNvGraphicFramePr>
@@ -25603,7 +25888,136 @@
                     </pic:cNvPicPr>
                   </pic:nvPicPr>
                   <pic:blipFill>
-                    <a:blip r:embed="rId17" cstate="none"/>
+                    <a:blip r:embed="rId25" cstate="none"/>
+                    <a:srcRect/>
+                    <a:stretch>
+                      <a:fillRect/>
+                    </a:stretch>
+                  </pic:blipFill>
+                  <pic:spPr bwMode="auto">
+                    <a:xfrm>
+                      <a:off x="0" y="0"/>
+                      <a:ext cx="4095750" cy="2286000"/>
+                    </a:xfrm>
+                    <a:prstGeom prst="rect">
+                      <a:avLst/>
+                    </a:prstGeom>
+                  </pic:spPr>
+                </pic:pic>
+              </a:graphicData>
+            </a:graphic>
+          </wp:inline>
+        </w:drawing>
+      </w:r>
+    </w:p>
+    <w:p>
+      <w:pPr>
+        <w:spacing w:after="110" w:line="300"/>
+        <w:jc w:val="both"/>
+      </w:pPr>
+      <w:r>
+        <w:rPr>
+          <w:rFonts w:ascii="Times New Roman" w:cs="Times New Roman" w:eastAsia="Times New Roman" w:hAnsi="Times New Roman"/>
+          <w:b/>
+          <w:bCs/>
+          <w:i w:val="false"/>
+          <w:iCs w:val="false"/>
+          <w:color w:val="2E7D32"/>
+          <w:sz w:val="24"/>
+          <w:szCs w:val="24"/>
+        </w:rPr>
+        <w:t xml:space="preserve">Définition — </w:t>
+      </w:r>
+      <w:r>
+        <w:rPr>
+          <w:rFonts w:ascii="Times New Roman" w:cs="Times New Roman" w:eastAsia="Times New Roman" w:hAnsi="Times New Roman"/>
+          <w:b/>
+          <w:bCs/>
+          <w:i w:val="false"/>
+          <w:iCs w:val="false"/>
+          <w:color w:val="000000"/>
+          <w:sz w:val="24"/>
+          <w:szCs w:val="24"/>
+        </w:rPr>
+        <w:t xml:space="preserve">Une équation du premier degré est une égalité contenant une inconnue (souvent x) dont la puissance est 1. Résoudre l’équation, c’est trouver la valeur de l’inconnue qui rend l’égalité vraie.</w:t>
+      </w:r>
+    </w:p>
+    <w:p>
+      <w:pPr>
+        <w:spacing w:after="110" w:line="300"/>
+        <w:jc w:val="both"/>
+      </w:pPr>
+      <w:r>
+        <w:rPr>
+          <w:rFonts w:ascii="Times New Roman" w:cs="Times New Roman" w:eastAsia="Times New Roman" w:hAnsi="Times New Roman"/>
+          <w:b/>
+          <w:bCs/>
+          <w:i w:val="false"/>
+          <w:iCs w:val="false"/>
+          <w:color w:val="1F4E79"/>
+          <w:sz w:val="24"/>
+          <w:szCs w:val="24"/>
+        </w:rPr>
+        <w:t xml:space="preserve">Autrement dit : </w:t>
+      </w:r>
+      <w:r>
+        <w:rPr>
+          <w:rFonts w:ascii="Times New Roman" w:cs="Times New Roman" w:eastAsia="Times New Roman" w:hAnsi="Times New Roman"/>
+          <w:b w:val="false"/>
+          <w:bCs w:val="false"/>
+          <w:i w:val="false"/>
+          <w:iCs w:val="false"/>
+          <w:color w:val="000000"/>
+          <w:sz w:val="24"/>
+          <w:szCs w:val="24"/>
+        </w:rPr>
+        <w:t xml:space="preserve">l’équation est une devinette : « quel nombre, multiplié par 3 puis augmenté de 5, donne 26 ? ». La solution est la réponse.</w:t>
+      </w:r>
+    </w:p>
+    <w:p>
+      <w:pPr>
+        <w:spacing w:after="110" w:line="300"/>
+        <w:jc w:val="both"/>
+      </w:pPr>
+      <w:r>
+        <w:rPr>
+          <w:rFonts w:ascii="Times New Roman" w:cs="Times New Roman" w:eastAsia="Times New Roman" w:hAnsi="Times New Roman"/>
+          <w:b w:val="false"/>
+          <w:bCs w:val="false"/>
+          <w:i w:val="false"/>
+          <w:iCs w:val="false"/>
+          <w:color w:val="000000"/>
+          <w:sz w:val="24"/>
+          <w:szCs w:val="24"/>
+        </w:rPr>
+        <w:t xml:space="preserve">Pour résoudre 3x + 5 = 26, on isole x en deux étapes : d’abord enlever 5 des deux côtés (3x = 21), puis diviser par 3 (x = 7). On vérifie toujours : 3 × 7 + 5 = 26 ✓. On défait les opérations dans l’ordre inverse du programme de calcul : le + 5 est enlevé avant le × 3.</w:t>
+      </w:r>
+    </w:p>
+    <w:p>
+      <w:pPr>
+        <w:spacing w:after="120" w:before="120"/>
+        <w:jc w:val="center"/>
+      </w:pPr>
+      <w:r>
+        <w:drawing>
+          <wp:inline distT="0" distB="0" distL="0" distR="0">
+            <wp:extent cx="4762500" cy="2076450"/>
+            <wp:effectExtent t="0" r="0" b="0" l="0"/>
+            <wp:docPr id="18" name="" descr="" title=""/>
+            <wp:cNvGraphicFramePr>
+              <a:graphicFrameLocks xmlns:a="http://schemas.openxmlformats.org/drawingml/2006/main" noChangeAspect="1"/>
+            </wp:cNvGraphicFramePr>
+            <a:graphic xmlns:a="http://schemas.openxmlformats.org/drawingml/2006/main">
+              <a:graphicData uri="http://schemas.openxmlformats.org/drawingml/2006/picture">
+                <pic:pic xmlns:pic="http://schemas.openxmlformats.org/drawingml/2006/picture">
+                  <pic:nvPicPr>
+                    <pic:cNvPr id="0" name="" descr=""/>
+                    <pic:cNvPicPr>
+                      <a:picLocks noChangeAspect="1" noChangeArrowheads="1"/>
+                    </pic:cNvPicPr>
+                  </pic:nvPicPr>
+                  <pic:blipFill>
+                    <a:blip r:embed="rId26" cstate="none"/>
                     <a:srcRect/>
                     <a:stretch>
                       <a:fillRect/>
@@ -28401,98 +28815,15 @@
     </w:p>
     <w:p>
       <w:pPr>
-        <w:spacing w:after="110" w:line="300"/>
-        <w:jc w:val="both"/>
-      </w:pPr>
-      <w:r>
-        <w:rPr>
-          <w:rFonts w:ascii="Times New Roman" w:cs="Times New Roman" w:eastAsia="Times New Roman" w:hAnsi="Times New Roman"/>
-          <w:b/>
-          <w:bCs/>
-          <w:i w:val="false"/>
-          <w:iCs w:val="false"/>
-          <w:color w:val="2E7D32"/>
-          <w:sz w:val="24"/>
-          <w:szCs w:val="24"/>
-        </w:rPr>
-        <w:t xml:space="preserve">Définition — </w:t>
-      </w:r>
-      <w:r>
-        <w:rPr>
-          <w:rFonts w:ascii="Times New Roman" w:cs="Times New Roman" w:eastAsia="Times New Roman" w:hAnsi="Times New Roman"/>
-          <w:b/>
-          <w:bCs/>
-          <w:i w:val="false"/>
-          <w:iCs w:val="false"/>
-          <w:color w:val="000000"/>
-          <w:sz w:val="24"/>
-          <w:szCs w:val="24"/>
-        </w:rPr>
-        <w:t xml:space="preserve">Réduire une expression littérale, c’est l’écrire avec le moins de termes possible en regroupant les termes semblables, c’est-à-dire ceux qui contiennent la même lettre.</w:t>
-      </w:r>
-    </w:p>
-    <w:p>
-      <w:pPr>
-        <w:spacing w:after="110" w:line="300"/>
-        <w:jc w:val="both"/>
-      </w:pPr>
-      <w:r>
-        <w:rPr>
-          <w:rFonts w:ascii="Times New Roman" w:cs="Times New Roman" w:eastAsia="Times New Roman" w:hAnsi="Times New Roman"/>
-          <w:b/>
-          <w:bCs/>
-          <w:i w:val="false"/>
-          <w:iCs w:val="false"/>
-          <w:color w:val="1F4E79"/>
-          <w:sz w:val="24"/>
-          <w:szCs w:val="24"/>
-        </w:rPr>
-        <w:t xml:space="preserve">Autrement dit : </w:t>
-      </w:r>
-      <w:r>
-        <w:rPr>
-          <w:rFonts w:ascii="Times New Roman" w:cs="Times New Roman" w:eastAsia="Times New Roman" w:hAnsi="Times New Roman"/>
-          <w:b w:val="false"/>
-          <w:bCs w:val="false"/>
-          <w:i w:val="false"/>
-          <w:iCs w:val="false"/>
-          <w:color w:val="000000"/>
-          <w:sz w:val="24"/>
-          <w:szCs w:val="24"/>
-        </w:rPr>
-        <w:t xml:space="preserve">on compte ensemble ce qui se ressemble : les sachets avec les sachets (5x + 2x = 7x), les billes seules à part.</w:t>
-      </w:r>
-    </w:p>
-    <w:p>
-      <w:pPr>
-        <w:spacing w:after="110" w:line="300"/>
-        <w:jc w:val="both"/>
-      </w:pPr>
-      <w:r>
-        <w:rPr>
-          <w:rFonts w:ascii="Times New Roman" w:cs="Times New Roman" w:eastAsia="Times New Roman" w:hAnsi="Times New Roman"/>
-          <w:b w:val="false"/>
-          <w:bCs w:val="false"/>
-          <w:i w:val="false"/>
-          <w:iCs w:val="false"/>
-          <w:color w:val="000000"/>
-          <w:sz w:val="24"/>
-          <w:szCs w:val="24"/>
-        </w:rPr>
-        <w:t xml:space="preserve">Grâce à la commutativité, on réordonne : 5x + 3 + 2x = 5x + 2x + 3 = 7x + 3. Les termes en x s’additionnent entre eux (5x + 2x = 7x, car 5 sachets et 2 sachets font 7 sachets), mais 7x + 3 ne se réduit pas davantage : un sachet et une bille seule ne se mélangent pas. Avec soustraction : 8a − 3a + 2 = 5a + 2.</w:t>
-      </w:r>
-    </w:p>
-    <w:p>
-      <w:pPr>
         <w:spacing w:after="120" w:before="120"/>
         <w:jc w:val="center"/>
       </w:pPr>
       <w:r>
         <w:drawing>
           <wp:inline distT="0" distB="0" distL="0" distR="0">
-            <wp:extent cx="4762500" cy="1571625"/>
+            <wp:extent cx="4095750" cy="2286000"/>
             <wp:effectExtent t="0" r="0" b="0" l="0"/>
-            <wp:docPr id="10" name="" descr="" title=""/>
+            <wp:docPr id="19" name="" descr="" title=""/>
             <wp:cNvGraphicFramePr>
               <a:graphicFrameLocks xmlns:a="http://schemas.openxmlformats.org/drawingml/2006/main" noChangeAspect="1"/>
             </wp:cNvGraphicFramePr>
@@ -28506,7 +28837,136 @@
                     </pic:cNvPicPr>
                   </pic:nvPicPr>
                   <pic:blipFill>
-                    <a:blip r:embed="rId18" cstate="none"/>
+                    <a:blip r:embed="rId27" cstate="none"/>
+                    <a:srcRect/>
+                    <a:stretch>
+                      <a:fillRect/>
+                    </a:stretch>
+                  </pic:blipFill>
+                  <pic:spPr bwMode="auto">
+                    <a:xfrm>
+                      <a:off x="0" y="0"/>
+                      <a:ext cx="4095750" cy="2286000"/>
+                    </a:xfrm>
+                    <a:prstGeom prst="rect">
+                      <a:avLst/>
+                    </a:prstGeom>
+                  </pic:spPr>
+                </pic:pic>
+              </a:graphicData>
+            </a:graphic>
+          </wp:inline>
+        </w:drawing>
+      </w:r>
+    </w:p>
+    <w:p>
+      <w:pPr>
+        <w:spacing w:after="110" w:line="300"/>
+        <w:jc w:val="both"/>
+      </w:pPr>
+      <w:r>
+        <w:rPr>
+          <w:rFonts w:ascii="Times New Roman" w:cs="Times New Roman" w:eastAsia="Times New Roman" w:hAnsi="Times New Roman"/>
+          <w:b/>
+          <w:bCs/>
+          <w:i w:val="false"/>
+          <w:iCs w:val="false"/>
+          <w:color w:val="2E7D32"/>
+          <w:sz w:val="24"/>
+          <w:szCs w:val="24"/>
+        </w:rPr>
+        <w:t xml:space="preserve">Définition — </w:t>
+      </w:r>
+      <w:r>
+        <w:rPr>
+          <w:rFonts w:ascii="Times New Roman" w:cs="Times New Roman" w:eastAsia="Times New Roman" w:hAnsi="Times New Roman"/>
+          <w:b/>
+          <w:bCs/>
+          <w:i w:val="false"/>
+          <w:iCs w:val="false"/>
+          <w:color w:val="000000"/>
+          <w:sz w:val="24"/>
+          <w:szCs w:val="24"/>
+        </w:rPr>
+        <w:t xml:space="preserve">Réduire une expression littérale, c’est l’écrire avec le moins de termes possible en regroupant les termes semblables, c’est-à-dire ceux qui contiennent la même lettre.</w:t>
+      </w:r>
+    </w:p>
+    <w:p>
+      <w:pPr>
+        <w:spacing w:after="110" w:line="300"/>
+        <w:jc w:val="both"/>
+      </w:pPr>
+      <w:r>
+        <w:rPr>
+          <w:rFonts w:ascii="Times New Roman" w:cs="Times New Roman" w:eastAsia="Times New Roman" w:hAnsi="Times New Roman"/>
+          <w:b/>
+          <w:bCs/>
+          <w:i w:val="false"/>
+          <w:iCs w:val="false"/>
+          <w:color w:val="1F4E79"/>
+          <w:sz w:val="24"/>
+          <w:szCs w:val="24"/>
+        </w:rPr>
+        <w:t xml:space="preserve">Autrement dit : </w:t>
+      </w:r>
+      <w:r>
+        <w:rPr>
+          <w:rFonts w:ascii="Times New Roman" w:cs="Times New Roman" w:eastAsia="Times New Roman" w:hAnsi="Times New Roman"/>
+          <w:b w:val="false"/>
+          <w:bCs w:val="false"/>
+          <w:i w:val="false"/>
+          <w:iCs w:val="false"/>
+          <w:color w:val="000000"/>
+          <w:sz w:val="24"/>
+          <w:szCs w:val="24"/>
+        </w:rPr>
+        <w:t xml:space="preserve">on compte ensemble ce qui se ressemble : les sachets avec les sachets (5x + 2x = 7x), les billes seules à part.</w:t>
+      </w:r>
+    </w:p>
+    <w:p>
+      <w:pPr>
+        <w:spacing w:after="110" w:line="300"/>
+        <w:jc w:val="both"/>
+      </w:pPr>
+      <w:r>
+        <w:rPr>
+          <w:rFonts w:ascii="Times New Roman" w:cs="Times New Roman" w:eastAsia="Times New Roman" w:hAnsi="Times New Roman"/>
+          <w:b w:val="false"/>
+          <w:bCs w:val="false"/>
+          <w:i w:val="false"/>
+          <w:iCs w:val="false"/>
+          <w:color w:val="000000"/>
+          <w:sz w:val="24"/>
+          <w:szCs w:val="24"/>
+        </w:rPr>
+        <w:t xml:space="preserve">Grâce à la commutativité, on réordonne : 5x + 3 + 2x = 5x + 2x + 3 = 7x + 3. Les termes en x s’additionnent entre eux (5x + 2x = 7x, car 5 sachets et 2 sachets font 7 sachets), mais 7x + 3 ne se réduit pas davantage : un sachet et une bille seule ne se mélangent pas. Avec soustraction : 8a − 3a + 2 = 5a + 2.</w:t>
+      </w:r>
+    </w:p>
+    <w:p>
+      <w:pPr>
+        <w:spacing w:after="120" w:before="120"/>
+        <w:jc w:val="center"/>
+      </w:pPr>
+      <w:r>
+        <w:drawing>
+          <wp:inline distT="0" distB="0" distL="0" distR="0">
+            <wp:extent cx="4762500" cy="1571625"/>
+            <wp:effectExtent t="0" r="0" b="0" l="0"/>
+            <wp:docPr id="20" name="" descr="" title=""/>
+            <wp:cNvGraphicFramePr>
+              <a:graphicFrameLocks xmlns:a="http://schemas.openxmlformats.org/drawingml/2006/main" noChangeAspect="1"/>
+            </wp:cNvGraphicFramePr>
+            <a:graphic xmlns:a="http://schemas.openxmlformats.org/drawingml/2006/main">
+              <a:graphicData uri="http://schemas.openxmlformats.org/drawingml/2006/picture">
+                <pic:pic xmlns:pic="http://schemas.openxmlformats.org/drawingml/2006/picture">
+                  <pic:nvPicPr>
+                    <pic:cNvPr id="0" name="" descr=""/>
+                    <pic:cNvPicPr>
+                      <a:picLocks noChangeAspect="1" noChangeArrowheads="1"/>
+                    </pic:cNvPicPr>
+                  </pic:nvPicPr>
+                  <pic:blipFill>
+                    <a:blip r:embed="rId28" cstate="none"/>
                     <a:srcRect/>
                     <a:stretch>
                       <a:fillRect/>
@@ -31250,98 +31710,15 @@
     </w:p>
     <w:p>
       <w:pPr>
-        <w:spacing w:after="110" w:line="300"/>
-        <w:jc w:val="both"/>
-      </w:pPr>
-      <w:r>
-        <w:rPr>
-          <w:rFonts w:ascii="Times New Roman" w:cs="Times New Roman" w:eastAsia="Times New Roman" w:hAnsi="Times New Roman"/>
-          <w:b/>
-          <w:bCs/>
-          <w:i w:val="false"/>
-          <w:iCs w:val="false"/>
-          <w:color w:val="2E7D32"/>
-          <w:sz w:val="24"/>
-          <w:szCs w:val="24"/>
-        </w:rPr>
-        <w:t xml:space="preserve">Définition — </w:t>
-      </w:r>
-      <w:r>
-        <w:rPr>
-          <w:rFonts w:ascii="Times New Roman" w:cs="Times New Roman" w:eastAsia="Times New Roman" w:hAnsi="Times New Roman"/>
-          <w:b/>
-          <w:bCs/>
-          <w:i w:val="false"/>
-          <w:iCs w:val="false"/>
-          <w:color w:val="000000"/>
-          <w:sz w:val="24"/>
-          <w:szCs w:val="24"/>
-        </w:rPr>
-        <w:t xml:space="preserve">Développer une expression littérale, c’est transformer un produit en somme en distribuant le facteur sur chaque terme de la parenthèse : k(a + b) = ka + kb.</w:t>
-      </w:r>
-    </w:p>
-    <w:p>
-      <w:pPr>
-        <w:spacing w:after="110" w:line="300"/>
-        <w:jc w:val="both"/>
-      </w:pPr>
-      <w:r>
-        <w:rPr>
-          <w:rFonts w:ascii="Times New Roman" w:cs="Times New Roman" w:eastAsia="Times New Roman" w:hAnsi="Times New Roman"/>
-          <w:b/>
-          <w:bCs/>
-          <w:i w:val="false"/>
-          <w:iCs w:val="false"/>
-          <w:color w:val="1F4E79"/>
-          <w:sz w:val="24"/>
-          <w:szCs w:val="24"/>
-        </w:rPr>
-        <w:t xml:space="preserve">Autrement dit : </w:t>
-      </w:r>
-      <w:r>
-        <w:rPr>
-          <w:rFonts w:ascii="Times New Roman" w:cs="Times New Roman" w:eastAsia="Times New Roman" w:hAnsi="Times New Roman"/>
-          <w:b w:val="false"/>
-          <w:bCs w:val="false"/>
-          <w:i w:val="false"/>
-          <w:iCs w:val="false"/>
-          <w:color w:val="000000"/>
-          <w:sz w:val="24"/>
-          <w:szCs w:val="24"/>
-        </w:rPr>
-        <w:t xml:space="preserve">on fait entrer le facteur dans la parenthèse : 4(2x + 3) devient 8x + 12.</w:t>
-      </w:r>
-    </w:p>
-    <w:p>
-      <w:pPr>
-        <w:spacing w:after="110" w:line="300"/>
-        <w:jc w:val="both"/>
-      </w:pPr>
-      <w:r>
-        <w:rPr>
-          <w:rFonts w:ascii="Times New Roman" w:cs="Times New Roman" w:eastAsia="Times New Roman" w:hAnsi="Times New Roman"/>
-          <w:b w:val="false"/>
-          <w:bCs w:val="false"/>
-          <w:i w:val="false"/>
-          <w:iCs w:val="false"/>
-          <w:color w:val="000000"/>
-          <w:sz w:val="24"/>
-          <w:szCs w:val="24"/>
-        </w:rPr>
-        <w:t xml:space="preserve">La distributivité s’applique aux lettres comme aux nombres : 4(2x + 3) = 4 × 2x + 4 × 3 = 8x + 12. Après un développement, on réduit souvent : 3(x + 2) + 2x = 3x + 6 + 2x = 5x + 6. Développer et réduire sont les deux gestes de base du calcul littéral.</w:t>
-      </w:r>
-    </w:p>
-    <w:p>
-      <w:pPr>
         <w:spacing w:after="120" w:before="120"/>
         <w:jc w:val="center"/>
       </w:pPr>
       <w:r>
         <w:drawing>
           <wp:inline distT="0" distB="0" distL="0" distR="0">
-            <wp:extent cx="4762500" cy="1571625"/>
+            <wp:extent cx="4095750" cy="2286000"/>
             <wp:effectExtent t="0" r="0" b="0" l="0"/>
-            <wp:docPr id="11" name="" descr="" title=""/>
+            <wp:docPr id="21" name="" descr="" title=""/>
             <wp:cNvGraphicFramePr>
               <a:graphicFrameLocks xmlns:a="http://schemas.openxmlformats.org/drawingml/2006/main" noChangeAspect="1"/>
             </wp:cNvGraphicFramePr>
@@ -31355,7 +31732,136 @@
                     </pic:cNvPicPr>
                   </pic:nvPicPr>
                   <pic:blipFill>
-                    <a:blip r:embed="rId19" cstate="none"/>
+                    <a:blip r:embed="rId29" cstate="none"/>
+                    <a:srcRect/>
+                    <a:stretch>
+                      <a:fillRect/>
+                    </a:stretch>
+                  </pic:blipFill>
+                  <pic:spPr bwMode="auto">
+                    <a:xfrm>
+                      <a:off x="0" y="0"/>
+                      <a:ext cx="4095750" cy="2286000"/>
+                    </a:xfrm>
+                    <a:prstGeom prst="rect">
+                      <a:avLst/>
+                    </a:prstGeom>
+                  </pic:spPr>
+                </pic:pic>
+              </a:graphicData>
+            </a:graphic>
+          </wp:inline>
+        </w:drawing>
+      </w:r>
+    </w:p>
+    <w:p>
+      <w:pPr>
+        <w:spacing w:after="110" w:line="300"/>
+        <w:jc w:val="both"/>
+      </w:pPr>
+      <w:r>
+        <w:rPr>
+          <w:rFonts w:ascii="Times New Roman" w:cs="Times New Roman" w:eastAsia="Times New Roman" w:hAnsi="Times New Roman"/>
+          <w:b/>
+          <w:bCs/>
+          <w:i w:val="false"/>
+          <w:iCs w:val="false"/>
+          <w:color w:val="2E7D32"/>
+          <w:sz w:val="24"/>
+          <w:szCs w:val="24"/>
+        </w:rPr>
+        <w:t xml:space="preserve">Définition — </w:t>
+      </w:r>
+      <w:r>
+        <w:rPr>
+          <w:rFonts w:ascii="Times New Roman" w:cs="Times New Roman" w:eastAsia="Times New Roman" w:hAnsi="Times New Roman"/>
+          <w:b/>
+          <w:bCs/>
+          <w:i w:val="false"/>
+          <w:iCs w:val="false"/>
+          <w:color w:val="000000"/>
+          <w:sz w:val="24"/>
+          <w:szCs w:val="24"/>
+        </w:rPr>
+        <w:t xml:space="preserve">Développer une expression littérale, c’est transformer un produit en somme en distribuant le facteur sur chaque terme de la parenthèse : k(a + b) = ka + kb.</w:t>
+      </w:r>
+    </w:p>
+    <w:p>
+      <w:pPr>
+        <w:spacing w:after="110" w:line="300"/>
+        <w:jc w:val="both"/>
+      </w:pPr>
+      <w:r>
+        <w:rPr>
+          <w:rFonts w:ascii="Times New Roman" w:cs="Times New Roman" w:eastAsia="Times New Roman" w:hAnsi="Times New Roman"/>
+          <w:b/>
+          <w:bCs/>
+          <w:i w:val="false"/>
+          <w:iCs w:val="false"/>
+          <w:color w:val="1F4E79"/>
+          <w:sz w:val="24"/>
+          <w:szCs w:val="24"/>
+        </w:rPr>
+        <w:t xml:space="preserve">Autrement dit : </w:t>
+      </w:r>
+      <w:r>
+        <w:rPr>
+          <w:rFonts w:ascii="Times New Roman" w:cs="Times New Roman" w:eastAsia="Times New Roman" w:hAnsi="Times New Roman"/>
+          <w:b w:val="false"/>
+          <w:bCs w:val="false"/>
+          <w:i w:val="false"/>
+          <w:iCs w:val="false"/>
+          <w:color w:val="000000"/>
+          <w:sz w:val="24"/>
+          <w:szCs w:val="24"/>
+        </w:rPr>
+        <w:t xml:space="preserve">on fait entrer le facteur dans la parenthèse : 4(2x + 3) devient 8x + 12.</w:t>
+      </w:r>
+    </w:p>
+    <w:p>
+      <w:pPr>
+        <w:spacing w:after="110" w:line="300"/>
+        <w:jc w:val="both"/>
+      </w:pPr>
+      <w:r>
+        <w:rPr>
+          <w:rFonts w:ascii="Times New Roman" w:cs="Times New Roman" w:eastAsia="Times New Roman" w:hAnsi="Times New Roman"/>
+          <w:b w:val="false"/>
+          <w:bCs w:val="false"/>
+          <w:i w:val="false"/>
+          <w:iCs w:val="false"/>
+          <w:color w:val="000000"/>
+          <w:sz w:val="24"/>
+          <w:szCs w:val="24"/>
+        </w:rPr>
+        <w:t xml:space="preserve">La distributivité s’applique aux lettres comme aux nombres : 4(2x + 3) = 4 × 2x + 4 × 3 = 8x + 12. Après un développement, on réduit souvent : 3(x + 2) + 2x = 3x + 6 + 2x = 5x + 6. Développer et réduire sont les deux gestes de base du calcul littéral.</w:t>
+      </w:r>
+    </w:p>
+    <w:p>
+      <w:pPr>
+        <w:spacing w:after="120" w:before="120"/>
+        <w:jc w:val="center"/>
+      </w:pPr>
+      <w:r>
+        <w:drawing>
+          <wp:inline distT="0" distB="0" distL="0" distR="0">
+            <wp:extent cx="4762500" cy="1571625"/>
+            <wp:effectExtent t="0" r="0" b="0" l="0"/>
+            <wp:docPr id="22" name="" descr="" title=""/>
+            <wp:cNvGraphicFramePr>
+              <a:graphicFrameLocks xmlns:a="http://schemas.openxmlformats.org/drawingml/2006/main" noChangeAspect="1"/>
+            </wp:cNvGraphicFramePr>
+            <a:graphic xmlns:a="http://schemas.openxmlformats.org/drawingml/2006/main">
+              <a:graphicData uri="http://schemas.openxmlformats.org/drawingml/2006/picture">
+                <pic:pic xmlns:pic="http://schemas.openxmlformats.org/drawingml/2006/picture">
+                  <pic:nvPicPr>
+                    <pic:cNvPr id="0" name="" descr=""/>
+                    <pic:cNvPicPr>
+                      <a:picLocks noChangeAspect="1" noChangeArrowheads="1"/>
+                    </pic:cNvPicPr>
+                  </pic:nvPicPr>
+                  <pic:blipFill>
+                    <a:blip r:embed="rId30" cstate="none"/>
                     <a:srcRect/>
                     <a:stretch>
                       <a:fillRect/>
@@ -34099,98 +34605,15 @@
     </w:p>
     <w:p>
       <w:pPr>
-        <w:spacing w:after="110" w:line="300"/>
-        <w:jc w:val="both"/>
-      </w:pPr>
-      <w:r>
-        <w:rPr>
-          <w:rFonts w:ascii="Times New Roman" w:cs="Times New Roman" w:eastAsia="Times New Roman" w:hAnsi="Times New Roman"/>
-          <w:b/>
-          <w:bCs/>
-          <w:i w:val="false"/>
-          <w:iCs w:val="false"/>
-          <w:color w:val="2E7D32"/>
-          <w:sz w:val="24"/>
-          <w:szCs w:val="24"/>
-        </w:rPr>
-        <w:t xml:space="preserve">Définition — </w:t>
-      </w:r>
-      <w:r>
-        <w:rPr>
-          <w:rFonts w:ascii="Times New Roman" w:cs="Times New Roman" w:eastAsia="Times New Roman" w:hAnsi="Times New Roman"/>
-          <w:b/>
-          <w:bCs/>
-          <w:i w:val="false"/>
-          <w:iCs w:val="false"/>
-          <w:color w:val="000000"/>
-          <w:sz w:val="24"/>
-          <w:szCs w:val="24"/>
-        </w:rPr>
-        <w:t xml:space="preserve">Substituer, c’est remplacer la variable d’une expression littérale par une valeur numérique donnée, en rétablissant les signes de multiplication cachés.</w:t>
-      </w:r>
-    </w:p>
-    <w:p>
-      <w:pPr>
-        <w:spacing w:after="110" w:line="300"/>
-        <w:jc w:val="both"/>
-      </w:pPr>
-      <w:r>
-        <w:rPr>
-          <w:rFonts w:ascii="Times New Roman" w:cs="Times New Roman" w:eastAsia="Times New Roman" w:hAnsi="Times New Roman"/>
-          <w:b/>
-          <w:bCs/>
-          <w:i w:val="false"/>
-          <w:iCs w:val="false"/>
-          <w:color w:val="1F4E79"/>
-          <w:sz w:val="24"/>
-          <w:szCs w:val="24"/>
-        </w:rPr>
-        <w:t xml:space="preserve">Autrement dit : </w:t>
-      </w:r>
-      <w:r>
-        <w:rPr>
-          <w:rFonts w:ascii="Times New Roman" w:cs="Times New Roman" w:eastAsia="Times New Roman" w:hAnsi="Times New Roman"/>
-          <w:b w:val="false"/>
-          <w:bCs w:val="false"/>
-          <w:i w:val="false"/>
-          <w:iCs w:val="false"/>
-          <w:color w:val="000000"/>
-          <w:sz w:val="24"/>
-          <w:szCs w:val="24"/>
-        </w:rPr>
-        <w:t xml:space="preserve">on glisse le nombre dans la « case » x : 2x + 7 avec x = 5 devient 2 × 5 + 7.</w:t>
-      </w:r>
-    </w:p>
-    <w:p>
-      <w:pPr>
-        <w:spacing w:after="110" w:line="300"/>
-        <w:jc w:val="both"/>
-      </w:pPr>
-      <w:r>
-        <w:rPr>
-          <w:rFonts w:ascii="Times New Roman" w:cs="Times New Roman" w:eastAsia="Times New Roman" w:hAnsi="Times New Roman"/>
-          <w:b w:val="false"/>
-          <w:bCs w:val="false"/>
-          <w:i w:val="false"/>
-          <w:iCs w:val="false"/>
-          <w:color w:val="000000"/>
-          <w:sz w:val="24"/>
-          <w:szCs w:val="24"/>
-        </w:rPr>
-        <w:t xml:space="preserve">Pour substituer x = 5 dans 2x + 7 : on écrit 2 × 5 + 7, car 2x signifie 2 × x ; puis on calcule en respectant les priorités : 10 + 7 = 17. La substitution sert à tester une formule, à vérifier la solution d’une équation ou à prédire une valeur.</w:t>
-      </w:r>
-    </w:p>
-    <w:p>
-      <w:pPr>
         <w:spacing w:after="120" w:before="120"/>
         <w:jc w:val="center"/>
       </w:pPr>
       <w:r>
         <w:drawing>
           <wp:inline distT="0" distB="0" distL="0" distR="0">
-            <wp:extent cx="4762500" cy="1352550"/>
+            <wp:extent cx="4095750" cy="2286000"/>
             <wp:effectExtent t="0" r="0" b="0" l="0"/>
-            <wp:docPr id="12" name="" descr="" title=""/>
+            <wp:docPr id="23" name="" descr="" title=""/>
             <wp:cNvGraphicFramePr>
               <a:graphicFrameLocks xmlns:a="http://schemas.openxmlformats.org/drawingml/2006/main" noChangeAspect="1"/>
             </wp:cNvGraphicFramePr>
@@ -34204,7 +34627,136 @@
                     </pic:cNvPicPr>
                   </pic:nvPicPr>
                   <pic:blipFill>
-                    <a:blip r:embed="rId20" cstate="none"/>
+                    <a:blip r:embed="rId31" cstate="none"/>
+                    <a:srcRect/>
+                    <a:stretch>
+                      <a:fillRect/>
+                    </a:stretch>
+                  </pic:blipFill>
+                  <pic:spPr bwMode="auto">
+                    <a:xfrm>
+                      <a:off x="0" y="0"/>
+                      <a:ext cx="4095750" cy="2286000"/>
+                    </a:xfrm>
+                    <a:prstGeom prst="rect">
+                      <a:avLst/>
+                    </a:prstGeom>
+                  </pic:spPr>
+                </pic:pic>
+              </a:graphicData>
+            </a:graphic>
+          </wp:inline>
+        </w:drawing>
+      </w:r>
+    </w:p>
+    <w:p>
+      <w:pPr>
+        <w:spacing w:after="110" w:line="300"/>
+        <w:jc w:val="both"/>
+      </w:pPr>
+      <w:r>
+        <w:rPr>
+          <w:rFonts w:ascii="Times New Roman" w:cs="Times New Roman" w:eastAsia="Times New Roman" w:hAnsi="Times New Roman"/>
+          <w:b/>
+          <w:bCs/>
+          <w:i w:val="false"/>
+          <w:iCs w:val="false"/>
+          <w:color w:val="2E7D32"/>
+          <w:sz w:val="24"/>
+          <w:szCs w:val="24"/>
+        </w:rPr>
+        <w:t xml:space="preserve">Définition — </w:t>
+      </w:r>
+      <w:r>
+        <w:rPr>
+          <w:rFonts w:ascii="Times New Roman" w:cs="Times New Roman" w:eastAsia="Times New Roman" w:hAnsi="Times New Roman"/>
+          <w:b/>
+          <w:bCs/>
+          <w:i w:val="false"/>
+          <w:iCs w:val="false"/>
+          <w:color w:val="000000"/>
+          <w:sz w:val="24"/>
+          <w:szCs w:val="24"/>
+        </w:rPr>
+        <w:t xml:space="preserve">Substituer, c’est remplacer la variable d’une expression littérale par une valeur numérique donnée, en rétablissant les signes de multiplication cachés.</w:t>
+      </w:r>
+    </w:p>
+    <w:p>
+      <w:pPr>
+        <w:spacing w:after="110" w:line="300"/>
+        <w:jc w:val="both"/>
+      </w:pPr>
+      <w:r>
+        <w:rPr>
+          <w:rFonts w:ascii="Times New Roman" w:cs="Times New Roman" w:eastAsia="Times New Roman" w:hAnsi="Times New Roman"/>
+          <w:b/>
+          <w:bCs/>
+          <w:i w:val="false"/>
+          <w:iCs w:val="false"/>
+          <w:color w:val="1F4E79"/>
+          <w:sz w:val="24"/>
+          <w:szCs w:val="24"/>
+        </w:rPr>
+        <w:t xml:space="preserve">Autrement dit : </w:t>
+      </w:r>
+      <w:r>
+        <w:rPr>
+          <w:rFonts w:ascii="Times New Roman" w:cs="Times New Roman" w:eastAsia="Times New Roman" w:hAnsi="Times New Roman"/>
+          <w:b w:val="false"/>
+          <w:bCs w:val="false"/>
+          <w:i w:val="false"/>
+          <w:iCs w:val="false"/>
+          <w:color w:val="000000"/>
+          <w:sz w:val="24"/>
+          <w:szCs w:val="24"/>
+        </w:rPr>
+        <w:t xml:space="preserve">on glisse le nombre dans la « case » x : 2x + 7 avec x = 5 devient 2 × 5 + 7.</w:t>
+      </w:r>
+    </w:p>
+    <w:p>
+      <w:pPr>
+        <w:spacing w:after="110" w:line="300"/>
+        <w:jc w:val="both"/>
+      </w:pPr>
+      <w:r>
+        <w:rPr>
+          <w:rFonts w:ascii="Times New Roman" w:cs="Times New Roman" w:eastAsia="Times New Roman" w:hAnsi="Times New Roman"/>
+          <w:b w:val="false"/>
+          <w:bCs w:val="false"/>
+          <w:i w:val="false"/>
+          <w:iCs w:val="false"/>
+          <w:color w:val="000000"/>
+          <w:sz w:val="24"/>
+          <w:szCs w:val="24"/>
+        </w:rPr>
+        <w:t xml:space="preserve">Pour substituer x = 5 dans 2x + 7 : on écrit 2 × 5 + 7, car 2x signifie 2 × x ; puis on calcule en respectant les priorités : 10 + 7 = 17. La substitution sert à tester une formule, à vérifier la solution d’une équation ou à prédire une valeur.</w:t>
+      </w:r>
+    </w:p>
+    <w:p>
+      <w:pPr>
+        <w:spacing w:after="120" w:before="120"/>
+        <w:jc w:val="center"/>
+      </w:pPr>
+      <w:r>
+        <w:drawing>
+          <wp:inline distT="0" distB="0" distL="0" distR="0">
+            <wp:extent cx="4762500" cy="1352550"/>
+            <wp:effectExtent t="0" r="0" b="0" l="0"/>
+            <wp:docPr id="24" name="" descr="" title=""/>
+            <wp:cNvGraphicFramePr>
+              <a:graphicFrameLocks xmlns:a="http://schemas.openxmlformats.org/drawingml/2006/main" noChangeAspect="1"/>
+            </wp:cNvGraphicFramePr>
+            <a:graphic xmlns:a="http://schemas.openxmlformats.org/drawingml/2006/main">
+              <a:graphicData uri="http://schemas.openxmlformats.org/drawingml/2006/picture">
+                <pic:pic xmlns:pic="http://schemas.openxmlformats.org/drawingml/2006/picture">
+                  <pic:nvPicPr>
+                    <pic:cNvPr id="0" name="" descr=""/>
+                    <pic:cNvPicPr>
+                      <a:picLocks noChangeAspect="1" noChangeArrowheads="1"/>
+                    </pic:cNvPicPr>
+                  </pic:nvPicPr>
+                  <pic:blipFill>
+                    <a:blip r:embed="rId32" cstate="none"/>
                     <a:srcRect/>
                     <a:stretch>
                       <a:fillRect/>
@@ -36948,98 +37500,15 @@
     </w:p>
     <w:p>
       <w:pPr>
-        <w:spacing w:after="110" w:line="300"/>
-        <w:jc w:val="both"/>
-      </w:pPr>
-      <w:r>
-        <w:rPr>
-          <w:rFonts w:ascii="Times New Roman" w:cs="Times New Roman" w:eastAsia="Times New Roman" w:hAnsi="Times New Roman"/>
-          <w:b/>
-          <w:bCs/>
-          <w:i w:val="false"/>
-          <w:iCs w:val="false"/>
-          <w:color w:val="2E7D32"/>
-          <w:sz w:val="24"/>
-          <w:szCs w:val="24"/>
-        </w:rPr>
-        <w:t xml:space="preserve">Définition — </w:t>
-      </w:r>
-      <w:r>
-        <w:rPr>
-          <w:rFonts w:ascii="Times New Roman" w:cs="Times New Roman" w:eastAsia="Times New Roman" w:hAnsi="Times New Roman"/>
-          <w:b/>
-          <w:bCs/>
-          <w:i w:val="false"/>
-          <w:iCs w:val="false"/>
-          <w:color w:val="000000"/>
-          <w:sz w:val="24"/>
-          <w:szCs w:val="24"/>
-        </w:rPr>
-        <w:t xml:space="preserve">La valeur numérique d’une expression littérale est le résultat obtenu lorsqu’on remplace chaque variable par sa valeur donnée, puis qu’on effectue tous les calculs.</w:t>
-      </w:r>
-    </w:p>
-    <w:p>
-      <w:pPr>
-        <w:spacing w:after="110" w:line="300"/>
-        <w:jc w:val="both"/>
-      </w:pPr>
-      <w:r>
-        <w:rPr>
-          <w:rFonts w:ascii="Times New Roman" w:cs="Times New Roman" w:eastAsia="Times New Roman" w:hAnsi="Times New Roman"/>
-          <w:b/>
-          <w:bCs/>
-          <w:i w:val="false"/>
-          <w:iCs w:val="false"/>
-          <w:color w:val="1F4E79"/>
-          <w:sz w:val="24"/>
-          <w:szCs w:val="24"/>
-        </w:rPr>
-        <w:t xml:space="preserve">Autrement dit : </w:t>
-      </w:r>
-      <w:r>
-        <w:rPr>
-          <w:rFonts w:ascii="Times New Roman" w:cs="Times New Roman" w:eastAsia="Times New Roman" w:hAnsi="Times New Roman"/>
-          <w:b w:val="false"/>
-          <w:bCs w:val="false"/>
-          <w:i w:val="false"/>
-          <w:iCs w:val="false"/>
-          <w:color w:val="000000"/>
-          <w:sz w:val="24"/>
-          <w:szCs w:val="24"/>
-        </w:rPr>
-        <w:t xml:space="preserve">chaque lettre reçoit son nombre, puis on calcule comme une chaîne d’opérations ordinaire.</w:t>
-      </w:r>
-    </w:p>
-    <w:p>
-      <w:pPr>
-        <w:spacing w:after="110" w:line="300"/>
-        <w:jc w:val="both"/>
-      </w:pPr>
-      <w:r>
-        <w:rPr>
-          <w:rFonts w:ascii="Times New Roman" w:cs="Times New Roman" w:eastAsia="Times New Roman" w:hAnsi="Times New Roman"/>
-          <w:b w:val="false"/>
-          <w:bCs w:val="false"/>
-          <w:i w:val="false"/>
-          <w:iCs w:val="false"/>
-          <w:color w:val="000000"/>
-          <w:sz w:val="24"/>
-          <w:szCs w:val="24"/>
-        </w:rPr>
-        <w:t xml:space="preserve">Pour A = 3a + 2b avec a = 4 et b = 1,5 : A = 3 × 4 + 2 × 1,5 = 12 + 3 = 15. Chaque lettre garde sa propre valeur pendant tout le calcul. Les formules de périmètre et d’aire s’évaluent ainsi : P = 2(L + l) avec L = 7 et l = 3 donne P = 2 × 10 = 20.</w:t>
-      </w:r>
-    </w:p>
-    <w:p>
-      <w:pPr>
         <w:spacing w:after="120" w:before="120"/>
         <w:jc w:val="center"/>
       </w:pPr>
       <w:r>
         <w:drawing>
           <wp:inline distT="0" distB="0" distL="0" distR="0">
-            <wp:extent cx="4762500" cy="1524000"/>
+            <wp:extent cx="4095750" cy="2286000"/>
             <wp:effectExtent t="0" r="0" b="0" l="0"/>
-            <wp:docPr id="13" name="" descr="" title=""/>
+            <wp:docPr id="25" name="" descr="" title=""/>
             <wp:cNvGraphicFramePr>
               <a:graphicFrameLocks xmlns:a="http://schemas.openxmlformats.org/drawingml/2006/main" noChangeAspect="1"/>
             </wp:cNvGraphicFramePr>
@@ -37053,7 +37522,136 @@
                     </pic:cNvPicPr>
                   </pic:nvPicPr>
                   <pic:blipFill>
-                    <a:blip r:embed="rId21" cstate="none"/>
+                    <a:blip r:embed="rId33" cstate="none"/>
+                    <a:srcRect/>
+                    <a:stretch>
+                      <a:fillRect/>
+                    </a:stretch>
+                  </pic:blipFill>
+                  <pic:spPr bwMode="auto">
+                    <a:xfrm>
+                      <a:off x="0" y="0"/>
+                      <a:ext cx="4095750" cy="2286000"/>
+                    </a:xfrm>
+                    <a:prstGeom prst="rect">
+                      <a:avLst/>
+                    </a:prstGeom>
+                  </pic:spPr>
+                </pic:pic>
+              </a:graphicData>
+            </a:graphic>
+          </wp:inline>
+        </w:drawing>
+      </w:r>
+    </w:p>
+    <w:p>
+      <w:pPr>
+        <w:spacing w:after="110" w:line="300"/>
+        <w:jc w:val="both"/>
+      </w:pPr>
+      <w:r>
+        <w:rPr>
+          <w:rFonts w:ascii="Times New Roman" w:cs="Times New Roman" w:eastAsia="Times New Roman" w:hAnsi="Times New Roman"/>
+          <w:b/>
+          <w:bCs/>
+          <w:i w:val="false"/>
+          <w:iCs w:val="false"/>
+          <w:color w:val="2E7D32"/>
+          <w:sz w:val="24"/>
+          <w:szCs w:val="24"/>
+        </w:rPr>
+        <w:t xml:space="preserve">Définition — </w:t>
+      </w:r>
+      <w:r>
+        <w:rPr>
+          <w:rFonts w:ascii="Times New Roman" w:cs="Times New Roman" w:eastAsia="Times New Roman" w:hAnsi="Times New Roman"/>
+          <w:b/>
+          <w:bCs/>
+          <w:i w:val="false"/>
+          <w:iCs w:val="false"/>
+          <w:color w:val="000000"/>
+          <w:sz w:val="24"/>
+          <w:szCs w:val="24"/>
+        </w:rPr>
+        <w:t xml:space="preserve">La valeur numérique d’une expression littérale est le résultat obtenu lorsqu’on remplace chaque variable par sa valeur donnée, puis qu’on effectue tous les calculs.</w:t>
+      </w:r>
+    </w:p>
+    <w:p>
+      <w:pPr>
+        <w:spacing w:after="110" w:line="300"/>
+        <w:jc w:val="both"/>
+      </w:pPr>
+      <w:r>
+        <w:rPr>
+          <w:rFonts w:ascii="Times New Roman" w:cs="Times New Roman" w:eastAsia="Times New Roman" w:hAnsi="Times New Roman"/>
+          <w:b/>
+          <w:bCs/>
+          <w:i w:val="false"/>
+          <w:iCs w:val="false"/>
+          <w:color w:val="1F4E79"/>
+          <w:sz w:val="24"/>
+          <w:szCs w:val="24"/>
+        </w:rPr>
+        <w:t xml:space="preserve">Autrement dit : </w:t>
+      </w:r>
+      <w:r>
+        <w:rPr>
+          <w:rFonts w:ascii="Times New Roman" w:cs="Times New Roman" w:eastAsia="Times New Roman" w:hAnsi="Times New Roman"/>
+          <w:b w:val="false"/>
+          <w:bCs w:val="false"/>
+          <w:i w:val="false"/>
+          <w:iCs w:val="false"/>
+          <w:color w:val="000000"/>
+          <w:sz w:val="24"/>
+          <w:szCs w:val="24"/>
+        </w:rPr>
+        <w:t xml:space="preserve">chaque lettre reçoit son nombre, puis on calcule comme une chaîne d’opérations ordinaire.</w:t>
+      </w:r>
+    </w:p>
+    <w:p>
+      <w:pPr>
+        <w:spacing w:after="110" w:line="300"/>
+        <w:jc w:val="both"/>
+      </w:pPr>
+      <w:r>
+        <w:rPr>
+          <w:rFonts w:ascii="Times New Roman" w:cs="Times New Roman" w:eastAsia="Times New Roman" w:hAnsi="Times New Roman"/>
+          <w:b w:val="false"/>
+          <w:bCs w:val="false"/>
+          <w:i w:val="false"/>
+          <w:iCs w:val="false"/>
+          <w:color w:val="000000"/>
+          <w:sz w:val="24"/>
+          <w:szCs w:val="24"/>
+        </w:rPr>
+        <w:t xml:space="preserve">Pour A = 3a + 2b avec a = 4 et b = 1,5 : A = 3 × 4 + 2 × 1,5 = 12 + 3 = 15. Chaque lettre garde sa propre valeur pendant tout le calcul. Les formules de périmètre et d’aire s’évaluent ainsi : P = 2(L + l) avec L = 7 et l = 3 donne P = 2 × 10 = 20.</w:t>
+      </w:r>
+    </w:p>
+    <w:p>
+      <w:pPr>
+        <w:spacing w:after="120" w:before="120"/>
+        <w:jc w:val="center"/>
+      </w:pPr>
+      <w:r>
+        <w:drawing>
+          <wp:inline distT="0" distB="0" distL="0" distR="0">
+            <wp:extent cx="4762500" cy="1524000"/>
+            <wp:effectExtent t="0" r="0" b="0" l="0"/>
+            <wp:docPr id="26" name="" descr="" title=""/>
+            <wp:cNvGraphicFramePr>
+              <a:graphicFrameLocks xmlns:a="http://schemas.openxmlformats.org/drawingml/2006/main" noChangeAspect="1"/>
+            </wp:cNvGraphicFramePr>
+            <a:graphic xmlns:a="http://schemas.openxmlformats.org/drawingml/2006/main">
+              <a:graphicData uri="http://schemas.openxmlformats.org/drawingml/2006/picture">
+                <pic:pic xmlns:pic="http://schemas.openxmlformats.org/drawingml/2006/picture">
+                  <pic:nvPicPr>
+                    <pic:cNvPr id="0" name="" descr=""/>
+                    <pic:cNvPicPr>
+                      <a:picLocks noChangeAspect="1" noChangeArrowheads="1"/>
+                    </pic:cNvPicPr>
+                  </pic:nvPicPr>
+                  <pic:blipFill>
+                    <a:blip r:embed="rId34" cstate="none"/>
                     <a:srcRect/>
                     <a:stretch>
                       <a:fillRect/>

</xml_diff>